<commit_message>
variable and data type add
</commit_message>
<xml_diff>
--- a/Assignment/JS Theory Assignment.docx
+++ b/Assignment/JS Theory Assignment.docx
@@ -80,6 +80,8 @@
         <w:ind w:right="-450"/>
         <w:rPr>
           <w:rFonts w:asciiTheme="majorBidi" w:hAnsiTheme="majorBidi" w:cstheme="majorBidi"/>
+          <w:b/>
+          <w:bCs/>
           <w:sz w:val="32"/>
           <w:szCs w:val="32"/>
         </w:rPr>
@@ -87,6 +89,8 @@
       <w:r>
         <w:rPr>
           <w:rFonts w:asciiTheme="majorBidi" w:hAnsiTheme="majorBidi" w:cstheme="majorBidi"/>
+          <w:b/>
+          <w:bCs/>
           <w:sz w:val="32"/>
           <w:szCs w:val="32"/>
         </w:rPr>
@@ -102,23 +106,13 @@
           <w:szCs w:val="32"/>
         </w:rPr>
       </w:pPr>
-      <w:proofErr w:type="gramStart"/>
       <w:r>
         <w:rPr>
           <w:rFonts w:asciiTheme="majorBidi" w:hAnsiTheme="majorBidi" w:cstheme="majorBidi"/>
           <w:sz w:val="32"/>
           <w:szCs w:val="32"/>
         </w:rPr>
-        <w:t>Ans :</w:t>
-      </w:r>
-      <w:proofErr w:type="gramEnd"/>
-      <w:r>
-        <w:rPr>
-          <w:rFonts w:asciiTheme="majorBidi" w:hAnsiTheme="majorBidi" w:cstheme="majorBidi"/>
-          <w:sz w:val="32"/>
-          <w:szCs w:val="32"/>
-        </w:rPr>
-        <w:t xml:space="preserve"> </w:t>
+        <w:t xml:space="preserve">Ans : </w:t>
       </w:r>
     </w:p>
     <w:p>
@@ -590,9 +584,11 @@
     </w:p>
     <w:p>
       <w:pPr>
-        <w:ind w:right="-450"/>
-        <w:rPr>
-          <w:rFonts w:asciiTheme="majorBidi" w:hAnsiTheme="majorBidi" w:cstheme="majorBidi"/>
+        <w:ind w:right="-630"/>
+        <w:rPr>
+          <w:rFonts w:asciiTheme="majorBidi" w:hAnsiTheme="majorBidi" w:cstheme="majorBidi"/>
+          <w:b/>
+          <w:bCs/>
           <w:sz w:val="32"/>
           <w:szCs w:val="32"/>
         </w:rPr>
@@ -600,27 +596,13 @@
       <w:r>
         <w:rPr>
           <w:rFonts w:asciiTheme="majorBidi" w:hAnsiTheme="majorBidi" w:cstheme="majorBidi"/>
+          <w:b/>
+          <w:bCs/>
           <w:sz w:val="32"/>
           <w:szCs w:val="32"/>
         </w:rPr>
         <w:lastRenderedPageBreak/>
-        <w:t>Question 2: How is JavaScript different from other programming languages like Python or</w:t>
-      </w:r>
-      <w:r>
-        <w:rPr>
-          <w:rFonts w:asciiTheme="majorBidi" w:hAnsiTheme="majorBidi" w:cstheme="majorBidi"/>
-          <w:sz w:val="32"/>
-          <w:szCs w:val="32"/>
-        </w:rPr>
-        <w:t xml:space="preserve"> </w:t>
-      </w:r>
-      <w:r>
-        <w:rPr>
-          <w:rFonts w:asciiTheme="majorBidi" w:hAnsiTheme="majorBidi" w:cstheme="majorBidi"/>
-          <w:sz w:val="32"/>
-          <w:szCs w:val="32"/>
-        </w:rPr>
-        <w:t>Java?</w:t>
+        <w:t>Question 2: How is JavaScript different from other programming languages like Python or Java?</w:t>
       </w:r>
     </w:p>
     <w:p>
@@ -632,23 +614,13 @@
           <w:szCs w:val="32"/>
         </w:rPr>
       </w:pPr>
-      <w:proofErr w:type="gramStart"/>
       <w:r>
         <w:rPr>
           <w:rFonts w:asciiTheme="majorBidi" w:hAnsiTheme="majorBidi" w:cstheme="majorBidi"/>
           <w:sz w:val="32"/>
           <w:szCs w:val="32"/>
         </w:rPr>
-        <w:t>Ans :</w:t>
-      </w:r>
-      <w:proofErr w:type="gramEnd"/>
-      <w:r>
-        <w:rPr>
-          <w:rFonts w:asciiTheme="majorBidi" w:hAnsiTheme="majorBidi" w:cstheme="majorBidi"/>
-          <w:sz w:val="32"/>
-          <w:szCs w:val="32"/>
-        </w:rPr>
-        <w:t xml:space="preserve"> </w:t>
+        <w:t xml:space="preserve">Ans : </w:t>
       </w:r>
     </w:p>
     <w:p>
@@ -1376,23 +1348,13 @@
           <w:szCs w:val="32"/>
         </w:rPr>
       </w:pPr>
-      <w:proofErr w:type="gramStart"/>
       <w:r>
         <w:rPr>
           <w:rFonts w:asciiTheme="majorBidi" w:hAnsiTheme="majorBidi" w:cstheme="majorBidi"/>
           <w:sz w:val="32"/>
           <w:szCs w:val="32"/>
         </w:rPr>
-        <w:t>Ans :</w:t>
-      </w:r>
-      <w:proofErr w:type="gramEnd"/>
-      <w:r>
-        <w:rPr>
-          <w:rFonts w:asciiTheme="majorBidi" w:hAnsiTheme="majorBidi" w:cstheme="majorBidi"/>
-          <w:sz w:val="32"/>
-          <w:szCs w:val="32"/>
-        </w:rPr>
-        <w:t xml:space="preserve"> </w:t>
+        <w:t xml:space="preserve">Ans : </w:t>
       </w:r>
     </w:p>
     <w:p>
@@ -1753,6 +1715,8 @@
         <w:ind w:right="-450"/>
         <w:rPr>
           <w:rFonts w:asciiTheme="majorBidi" w:hAnsiTheme="majorBidi" w:cstheme="majorBidi"/>
+          <w:b/>
+          <w:bCs/>
           <w:sz w:val="36"/>
           <w:szCs w:val="36"/>
         </w:rPr>
@@ -1760,26 +1724,12 @@
       <w:r>
         <w:rPr>
           <w:rFonts w:asciiTheme="majorBidi" w:hAnsiTheme="majorBidi" w:cstheme="majorBidi"/>
+          <w:b/>
+          <w:bCs/>
           <w:sz w:val="36"/>
           <w:szCs w:val="36"/>
         </w:rPr>
-        <w:t>Question 1: What are variables in JavaScript? How do you declare a variable using var, let,</w:t>
-      </w:r>
-      <w:r>
-        <w:rPr>
-          <w:rFonts w:asciiTheme="majorBidi" w:hAnsiTheme="majorBidi" w:cstheme="majorBidi"/>
-          <w:sz w:val="36"/>
-          <w:szCs w:val="36"/>
-        </w:rPr>
-        <w:t xml:space="preserve"> </w:t>
-      </w:r>
-      <w:r>
-        <w:rPr>
-          <w:rFonts w:asciiTheme="majorBidi" w:hAnsiTheme="majorBidi" w:cstheme="majorBidi"/>
-          <w:sz w:val="36"/>
-          <w:szCs w:val="36"/>
-        </w:rPr>
-        <w:t>and const?</w:t>
+        <w:t>Question 1: What are variables in JavaScript? How do you declare a variable using var, let, and const?</w:t>
       </w:r>
     </w:p>
     <w:p>
@@ -1791,23 +1741,13 @@
           <w:szCs w:val="36"/>
         </w:rPr>
       </w:pPr>
-      <w:proofErr w:type="gramStart"/>
       <w:r>
         <w:rPr>
           <w:rFonts w:asciiTheme="majorBidi" w:hAnsiTheme="majorBidi" w:cstheme="majorBidi"/>
           <w:sz w:val="36"/>
           <w:szCs w:val="36"/>
         </w:rPr>
-        <w:t>Ans :</w:t>
-      </w:r>
-      <w:proofErr w:type="gramEnd"/>
-      <w:r>
-        <w:rPr>
-          <w:rFonts w:asciiTheme="majorBidi" w:hAnsiTheme="majorBidi" w:cstheme="majorBidi"/>
-          <w:sz w:val="36"/>
-          <w:szCs w:val="36"/>
-        </w:rPr>
-        <w:t xml:space="preserve"> </w:t>
+        <w:t xml:space="preserve">Ans : </w:t>
       </w:r>
     </w:p>
     <w:p>
@@ -1861,18 +1801,8 @@
           <w:sz w:val="36"/>
           <w:szCs w:val="36"/>
         </w:rPr>
-        <w:t xml:space="preserve">// </w:t>
+        <w:t>// 1)Nothing</w:t>
       </w:r>
-      <w:proofErr w:type="gramStart"/>
-      <w:r>
-        <w:rPr>
-          <w:rFonts w:asciiTheme="majorBidi" w:hAnsiTheme="majorBidi" w:cstheme="majorBidi"/>
-          <w:sz w:val="36"/>
-          <w:szCs w:val="36"/>
-        </w:rPr>
-        <w:t>1)Nothing</w:t>
-      </w:r>
-      <w:proofErr w:type="gramEnd"/>
     </w:p>
     <w:p>
       <w:pPr>
@@ -1948,7 +1878,6 @@
         </w:rPr>
       </w:pPr>
       <w:proofErr w:type="spellStart"/>
-      <w:proofErr w:type="gramStart"/>
       <w:r>
         <w:rPr>
           <w:rFonts w:asciiTheme="majorBidi" w:hAnsiTheme="majorBidi" w:cstheme="majorBidi"/>
@@ -1958,23 +1887,13 @@
         <w:t>document.getElementById</w:t>
       </w:r>
       <w:proofErr w:type="spellEnd"/>
-      <w:proofErr w:type="gramEnd"/>
       <w:r>
         <w:rPr>
           <w:rFonts w:asciiTheme="majorBidi" w:hAnsiTheme="majorBidi" w:cstheme="majorBidi"/>
           <w:sz w:val="36"/>
           <w:szCs w:val="36"/>
         </w:rPr>
-        <w:t>('demo'</w:t>
-      </w:r>
-      <w:proofErr w:type="gramStart"/>
-      <w:r>
-        <w:rPr>
-          <w:rFonts w:asciiTheme="majorBidi" w:hAnsiTheme="majorBidi" w:cstheme="majorBidi"/>
-          <w:sz w:val="36"/>
-          <w:szCs w:val="36"/>
-        </w:rPr>
-        <w:t>).</w:t>
+        <w:t>('demo').</w:t>
       </w:r>
       <w:proofErr w:type="spellStart"/>
       <w:r>
@@ -1986,7 +1905,6 @@
         <w:t>innerHTML</w:t>
       </w:r>
       <w:proofErr w:type="spellEnd"/>
-      <w:proofErr w:type="gramEnd"/>
       <w:r>
         <w:rPr>
           <w:rFonts w:asciiTheme="majorBidi" w:hAnsiTheme="majorBidi" w:cstheme="majorBidi"/>
@@ -2006,7 +1924,6 @@
         </w:rPr>
       </w:pPr>
       <w:proofErr w:type="spellStart"/>
-      <w:proofErr w:type="gramStart"/>
       <w:r>
         <w:rPr>
           <w:rFonts w:asciiTheme="majorBidi" w:hAnsiTheme="majorBidi" w:cstheme="majorBidi"/>
@@ -2016,7 +1933,6 @@
         <w:t>document.write</w:t>
       </w:r>
       <w:proofErr w:type="spellEnd"/>
-      <w:proofErr w:type="gramEnd"/>
       <w:r>
         <w:rPr>
           <w:rFonts w:asciiTheme="majorBidi" w:hAnsiTheme="majorBidi" w:cstheme="majorBidi"/>
@@ -2041,25 +1957,7 @@
           <w:sz w:val="36"/>
           <w:szCs w:val="36"/>
         </w:rPr>
-        <w:t xml:space="preserve">&gt; Minus is </w:t>
-      </w:r>
-      <w:proofErr w:type="gramStart"/>
-      <w:r>
-        <w:rPr>
-          <w:rFonts w:asciiTheme="majorBidi" w:hAnsiTheme="majorBidi" w:cstheme="majorBidi"/>
-          <w:sz w:val="36"/>
-          <w:szCs w:val="36"/>
-        </w:rPr>
-        <w:t>',a</w:t>
-      </w:r>
-      <w:proofErr w:type="gramEnd"/>
-      <w:r>
-        <w:rPr>
-          <w:rFonts w:asciiTheme="majorBidi" w:hAnsiTheme="majorBidi" w:cstheme="majorBidi"/>
-          <w:sz w:val="36"/>
-          <w:szCs w:val="36"/>
-        </w:rPr>
-        <w:t>-b)</w:t>
+        <w:t>&gt; Minus is ',a-b)</w:t>
       </w:r>
     </w:p>
     <w:p>
@@ -2072,7 +1970,6 @@
         </w:rPr>
       </w:pPr>
       <w:proofErr w:type="spellStart"/>
-      <w:proofErr w:type="gramStart"/>
       <w:r>
         <w:rPr>
           <w:rFonts w:asciiTheme="majorBidi" w:hAnsiTheme="majorBidi" w:cstheme="majorBidi"/>
@@ -2082,7 +1979,6 @@
         <w:t>document.write</w:t>
       </w:r>
       <w:proofErr w:type="spellEnd"/>
-      <w:proofErr w:type="gramEnd"/>
       <w:r>
         <w:rPr>
           <w:rFonts w:asciiTheme="majorBidi" w:hAnsiTheme="majorBidi" w:cstheme="majorBidi"/>
@@ -2125,25 +2021,7 @@
           <w:sz w:val="36"/>
           <w:szCs w:val="36"/>
         </w:rPr>
-        <w:t xml:space="preserve">// </w:t>
-      </w:r>
-      <w:proofErr w:type="gramStart"/>
-      <w:r>
-        <w:rPr>
-          <w:rFonts w:asciiTheme="majorBidi" w:hAnsiTheme="majorBidi" w:cstheme="majorBidi"/>
-          <w:sz w:val="36"/>
-          <w:szCs w:val="36"/>
-        </w:rPr>
-        <w:t>2)var</w:t>
-      </w:r>
-      <w:proofErr w:type="gramEnd"/>
-      <w:r>
-        <w:rPr>
-          <w:rFonts w:asciiTheme="majorBidi" w:hAnsiTheme="majorBidi" w:cstheme="majorBidi"/>
-          <w:sz w:val="36"/>
-          <w:szCs w:val="36"/>
-        </w:rPr>
-        <w:t xml:space="preserve"> keyword = redeclare &amp; reassign both are possible</w:t>
+        <w:t>// 2)var keyword = redeclare &amp; reassign both are possible</w:t>
       </w:r>
     </w:p>
     <w:p>
@@ -2174,7 +2052,6 @@
         </w:rPr>
       </w:pPr>
       <w:proofErr w:type="spellStart"/>
-      <w:proofErr w:type="gramStart"/>
       <w:r>
         <w:rPr>
           <w:rFonts w:asciiTheme="majorBidi" w:hAnsiTheme="majorBidi" w:cstheme="majorBidi"/>
@@ -2184,7 +2061,6 @@
         <w:t>document.write</w:t>
       </w:r>
       <w:proofErr w:type="spellEnd"/>
-      <w:proofErr w:type="gramEnd"/>
       <w:r>
         <w:rPr>
           <w:rFonts w:asciiTheme="majorBidi" w:hAnsiTheme="majorBidi" w:cstheme="majorBidi"/>
@@ -2240,7 +2116,6 @@
         </w:rPr>
       </w:pPr>
       <w:proofErr w:type="spellStart"/>
-      <w:proofErr w:type="gramStart"/>
       <w:r>
         <w:rPr>
           <w:rFonts w:asciiTheme="majorBidi" w:hAnsiTheme="majorBidi" w:cstheme="majorBidi"/>
@@ -2250,7 +2125,6 @@
         <w:t>document.write</w:t>
       </w:r>
       <w:proofErr w:type="spellEnd"/>
-      <w:proofErr w:type="gramEnd"/>
       <w:r>
         <w:rPr>
           <w:rFonts w:asciiTheme="majorBidi" w:hAnsiTheme="majorBidi" w:cstheme="majorBidi"/>
@@ -2293,61 +2167,7 @@
           <w:sz w:val="36"/>
           <w:szCs w:val="36"/>
         </w:rPr>
-        <w:t xml:space="preserve">// </w:t>
-      </w:r>
-      <w:proofErr w:type="gramStart"/>
-      <w:r>
-        <w:rPr>
-          <w:rFonts w:asciiTheme="majorBidi" w:hAnsiTheme="majorBidi" w:cstheme="majorBidi"/>
-          <w:sz w:val="36"/>
-          <w:szCs w:val="36"/>
-        </w:rPr>
-        <w:t>3)const</w:t>
-      </w:r>
-      <w:proofErr w:type="gramEnd"/>
-      <w:r>
-        <w:rPr>
-          <w:rFonts w:asciiTheme="majorBidi" w:hAnsiTheme="majorBidi" w:cstheme="majorBidi"/>
-          <w:sz w:val="36"/>
-          <w:szCs w:val="36"/>
-        </w:rPr>
-        <w:t xml:space="preserve"> - </w:t>
-      </w:r>
-      <w:proofErr w:type="gramStart"/>
-      <w:r>
-        <w:rPr>
-          <w:rFonts w:asciiTheme="majorBidi" w:hAnsiTheme="majorBidi" w:cstheme="majorBidi"/>
-          <w:sz w:val="36"/>
-          <w:szCs w:val="36"/>
-        </w:rPr>
-        <w:t>constant  -</w:t>
-      </w:r>
-      <w:proofErr w:type="gramEnd"/>
-      <w:r>
-        <w:rPr>
-          <w:rFonts w:asciiTheme="majorBidi" w:hAnsiTheme="majorBidi" w:cstheme="majorBidi"/>
-          <w:sz w:val="36"/>
-          <w:szCs w:val="36"/>
-        </w:rPr>
-        <w:t xml:space="preserve"> </w:t>
-      </w:r>
-      <w:proofErr w:type="gramStart"/>
-      <w:r>
-        <w:rPr>
-          <w:rFonts w:asciiTheme="majorBidi" w:hAnsiTheme="majorBidi" w:cstheme="majorBidi"/>
-          <w:sz w:val="36"/>
-          <w:szCs w:val="36"/>
-        </w:rPr>
-        <w:t>cant</w:t>
-      </w:r>
-      <w:proofErr w:type="gramEnd"/>
-      <w:r>
-        <w:rPr>
-          <w:rFonts w:asciiTheme="majorBidi" w:hAnsiTheme="majorBidi" w:cstheme="majorBidi"/>
-          <w:sz w:val="36"/>
-          <w:szCs w:val="36"/>
-        </w:rPr>
-        <w:t xml:space="preserve"> possible redeclare &amp; reassign</w:t>
+        <w:t>// 3)const - constant  - cant possible redeclare &amp; reassign</w:t>
       </w:r>
     </w:p>
     <w:p>
@@ -2378,7 +2198,6 @@
         </w:rPr>
       </w:pPr>
       <w:proofErr w:type="spellStart"/>
-      <w:proofErr w:type="gramStart"/>
       <w:r>
         <w:rPr>
           <w:rFonts w:asciiTheme="majorBidi" w:hAnsiTheme="majorBidi" w:cstheme="majorBidi"/>
@@ -2389,7 +2208,6 @@
         <w:t>document.write</w:t>
       </w:r>
       <w:proofErr w:type="spellEnd"/>
-      <w:proofErr w:type="gramEnd"/>
       <w:r>
         <w:rPr>
           <w:rFonts w:asciiTheme="majorBidi" w:hAnsiTheme="majorBidi" w:cstheme="majorBidi"/>
@@ -2414,25 +2232,7 @@
           <w:sz w:val="36"/>
           <w:szCs w:val="36"/>
         </w:rPr>
-        <w:t xml:space="preserve">&gt;Pi is </w:t>
-      </w:r>
-      <w:proofErr w:type="gramStart"/>
-      <w:r>
-        <w:rPr>
-          <w:rFonts w:asciiTheme="majorBidi" w:hAnsiTheme="majorBidi" w:cstheme="majorBidi"/>
-          <w:sz w:val="36"/>
-          <w:szCs w:val="36"/>
-        </w:rPr>
-        <w:t>',pi</w:t>
-      </w:r>
-      <w:proofErr w:type="gramEnd"/>
-      <w:r>
-        <w:rPr>
-          <w:rFonts w:asciiTheme="majorBidi" w:hAnsiTheme="majorBidi" w:cstheme="majorBidi"/>
-          <w:sz w:val="36"/>
-          <w:szCs w:val="36"/>
-        </w:rPr>
-        <w:t>)</w:t>
+        <w:t>&gt;Pi is ',pi)</w:t>
       </w:r>
     </w:p>
     <w:p>
@@ -2489,7 +2289,6 @@
         <w:t xml:space="preserve">// </w:t>
       </w:r>
       <w:proofErr w:type="spellStart"/>
-      <w:proofErr w:type="gramStart"/>
       <w:r>
         <w:rPr>
           <w:rFonts w:asciiTheme="majorBidi" w:hAnsiTheme="majorBidi" w:cstheme="majorBidi"/>
@@ -2499,7 +2298,6 @@
         <w:t>document.write</w:t>
       </w:r>
       <w:proofErr w:type="spellEnd"/>
-      <w:proofErr w:type="gramEnd"/>
       <w:r>
         <w:rPr>
           <w:rFonts w:asciiTheme="majorBidi" w:hAnsiTheme="majorBidi" w:cstheme="majorBidi"/>
@@ -2524,25 +2322,7 @@
           <w:sz w:val="36"/>
           <w:szCs w:val="36"/>
         </w:rPr>
-        <w:t xml:space="preserve">&gt;Pi is </w:t>
-      </w:r>
-      <w:proofErr w:type="gramStart"/>
-      <w:r>
-        <w:rPr>
-          <w:rFonts w:asciiTheme="majorBidi" w:hAnsiTheme="majorBidi" w:cstheme="majorBidi"/>
-          <w:sz w:val="36"/>
-          <w:szCs w:val="36"/>
-        </w:rPr>
-        <w:t>',pi</w:t>
-      </w:r>
-      <w:proofErr w:type="gramEnd"/>
-      <w:r>
-        <w:rPr>
-          <w:rFonts w:asciiTheme="majorBidi" w:hAnsiTheme="majorBidi" w:cstheme="majorBidi"/>
-          <w:sz w:val="36"/>
-          <w:szCs w:val="36"/>
-        </w:rPr>
-        <w:t>)</w:t>
+        <w:t>&gt;Pi is ',pi)</w:t>
       </w:r>
     </w:p>
     <w:p>
@@ -2560,43 +2340,7 @@
           <w:sz w:val="36"/>
           <w:szCs w:val="36"/>
         </w:rPr>
-        <w:t xml:space="preserve">// </w:t>
-      </w:r>
-      <w:proofErr w:type="gramStart"/>
-      <w:r>
-        <w:rPr>
-          <w:rFonts w:asciiTheme="majorBidi" w:hAnsiTheme="majorBidi" w:cstheme="majorBidi"/>
-          <w:sz w:val="36"/>
-          <w:szCs w:val="36"/>
-        </w:rPr>
-        <w:t>4)let</w:t>
-      </w:r>
-      <w:proofErr w:type="gramEnd"/>
-      <w:r>
-        <w:rPr>
-          <w:rFonts w:asciiTheme="majorBidi" w:hAnsiTheme="majorBidi" w:cstheme="majorBidi"/>
-          <w:sz w:val="36"/>
-          <w:szCs w:val="36"/>
-        </w:rPr>
-        <w:t xml:space="preserve"> keyword = </w:t>
-      </w:r>
-      <w:proofErr w:type="gramStart"/>
-      <w:r>
-        <w:rPr>
-          <w:rFonts w:asciiTheme="majorBidi" w:hAnsiTheme="majorBidi" w:cstheme="majorBidi"/>
-          <w:sz w:val="36"/>
-          <w:szCs w:val="36"/>
-        </w:rPr>
-        <w:t>cant</w:t>
-      </w:r>
-      <w:proofErr w:type="gramEnd"/>
-      <w:r>
-        <w:rPr>
-          <w:rFonts w:asciiTheme="majorBidi" w:hAnsiTheme="majorBidi" w:cstheme="majorBidi"/>
-          <w:sz w:val="36"/>
-          <w:szCs w:val="36"/>
-        </w:rPr>
-        <w:t xml:space="preserve"> redeclare but reassign is possible</w:t>
+        <w:t>// 4)let keyword = cant redeclare but reassign is possible</w:t>
       </w:r>
     </w:p>
     <w:p>
@@ -2627,7 +2371,6 @@
         </w:rPr>
       </w:pPr>
       <w:proofErr w:type="spellStart"/>
-      <w:proofErr w:type="gramStart"/>
       <w:r>
         <w:rPr>
           <w:rFonts w:asciiTheme="majorBidi" w:hAnsiTheme="majorBidi" w:cstheme="majorBidi"/>
@@ -2637,7 +2380,6 @@
         <w:t>document.write</w:t>
       </w:r>
       <w:proofErr w:type="spellEnd"/>
-      <w:proofErr w:type="gramEnd"/>
       <w:r>
         <w:rPr>
           <w:rFonts w:asciiTheme="majorBidi" w:hAnsiTheme="majorBidi" w:cstheme="majorBidi"/>
@@ -2752,6 +2494,2280 @@
         <w:ind w:right="-450"/>
         <w:rPr>
           <w:rFonts w:asciiTheme="majorBidi" w:hAnsiTheme="majorBidi" w:cstheme="majorBidi"/>
+          <w:sz w:val="36"/>
+          <w:szCs w:val="36"/>
+        </w:rPr>
+      </w:pPr>
+    </w:p>
+    <w:p>
+      <w:pPr>
+        <w:ind w:right="-450"/>
+        <w:rPr>
+          <w:rFonts w:asciiTheme="majorBidi" w:hAnsiTheme="majorBidi" w:cstheme="majorBidi"/>
+          <w:sz w:val="36"/>
+          <w:szCs w:val="36"/>
+        </w:rPr>
+      </w:pPr>
+    </w:p>
+    <w:p>
+      <w:pPr>
+        <w:ind w:right="-450"/>
+        <w:rPr>
+          <w:rFonts w:asciiTheme="majorBidi" w:hAnsiTheme="majorBidi" w:cstheme="majorBidi"/>
+          <w:sz w:val="36"/>
+          <w:szCs w:val="36"/>
+        </w:rPr>
+      </w:pPr>
+    </w:p>
+    <w:p>
+      <w:pPr>
+        <w:ind w:right="-450"/>
+        <w:rPr>
+          <w:rFonts w:asciiTheme="majorBidi" w:hAnsiTheme="majorBidi" w:cstheme="majorBidi"/>
+          <w:sz w:val="36"/>
+          <w:szCs w:val="36"/>
+        </w:rPr>
+      </w:pPr>
+    </w:p>
+    <w:p>
+      <w:pPr>
+        <w:ind w:right="-450"/>
+        <w:rPr>
+          <w:rFonts w:asciiTheme="majorBidi" w:hAnsiTheme="majorBidi" w:cstheme="majorBidi"/>
+          <w:sz w:val="36"/>
+          <w:szCs w:val="36"/>
+        </w:rPr>
+      </w:pPr>
+    </w:p>
+    <w:p>
+      <w:pPr>
+        <w:ind w:right="-450"/>
+        <w:rPr>
+          <w:rFonts w:asciiTheme="majorBidi" w:hAnsiTheme="majorBidi" w:cstheme="majorBidi"/>
+          <w:sz w:val="36"/>
+          <w:szCs w:val="36"/>
+        </w:rPr>
+      </w:pPr>
+    </w:p>
+    <w:p>
+      <w:pPr>
+        <w:ind w:right="-450"/>
+        <w:rPr>
+          <w:rFonts w:asciiTheme="majorBidi" w:hAnsiTheme="majorBidi" w:cstheme="majorBidi"/>
+          <w:sz w:val="36"/>
+          <w:szCs w:val="36"/>
+        </w:rPr>
+      </w:pPr>
+    </w:p>
+    <w:p>
+      <w:pPr>
+        <w:ind w:right="-450"/>
+        <w:rPr>
+          <w:rFonts w:asciiTheme="majorBidi" w:hAnsiTheme="majorBidi" w:cstheme="majorBidi"/>
+          <w:sz w:val="36"/>
+          <w:szCs w:val="36"/>
+        </w:rPr>
+      </w:pPr>
+    </w:p>
+    <w:p>
+      <w:pPr>
+        <w:ind w:right="-450"/>
+        <w:rPr>
+          <w:rFonts w:asciiTheme="majorBidi" w:hAnsiTheme="majorBidi" w:cstheme="majorBidi"/>
+          <w:sz w:val="36"/>
+          <w:szCs w:val="36"/>
+        </w:rPr>
+      </w:pPr>
+    </w:p>
+    <w:p>
+      <w:pPr>
+        <w:ind w:right="-450"/>
+        <w:rPr>
+          <w:rFonts w:asciiTheme="majorBidi" w:hAnsiTheme="majorBidi" w:cstheme="majorBidi"/>
+          <w:sz w:val="36"/>
+          <w:szCs w:val="36"/>
+        </w:rPr>
+      </w:pPr>
+    </w:p>
+    <w:p>
+      <w:pPr>
+        <w:ind w:right="-450"/>
+        <w:rPr>
+          <w:rFonts w:asciiTheme="majorBidi" w:hAnsiTheme="majorBidi" w:cstheme="majorBidi"/>
+          <w:sz w:val="36"/>
+          <w:szCs w:val="36"/>
+        </w:rPr>
+      </w:pPr>
+    </w:p>
+    <w:p>
+      <w:pPr>
+        <w:ind w:right="-450"/>
+        <w:rPr>
+          <w:rFonts w:asciiTheme="majorBidi" w:hAnsiTheme="majorBidi" w:cstheme="majorBidi"/>
+          <w:sz w:val="36"/>
+          <w:szCs w:val="36"/>
+        </w:rPr>
+      </w:pPr>
+    </w:p>
+    <w:p>
+      <w:pPr>
+        <w:ind w:right="-450"/>
+        <w:rPr>
+          <w:rFonts w:asciiTheme="majorBidi" w:hAnsiTheme="majorBidi" w:cstheme="majorBidi"/>
+          <w:sz w:val="36"/>
+          <w:szCs w:val="36"/>
+        </w:rPr>
+      </w:pPr>
+    </w:p>
+    <w:p>
+      <w:pPr>
+        <w:ind w:right="-450"/>
+        <w:rPr>
+          <w:rFonts w:asciiTheme="majorBidi" w:hAnsiTheme="majorBidi" w:cstheme="majorBidi"/>
+          <w:b/>
+          <w:bCs/>
+          <w:sz w:val="36"/>
+          <w:szCs w:val="36"/>
+        </w:rPr>
+      </w:pPr>
+      <w:r>
+        <w:rPr>
+          <w:rFonts w:asciiTheme="majorBidi" w:hAnsiTheme="majorBidi" w:cstheme="majorBidi"/>
+          <w:b/>
+          <w:bCs/>
+          <w:sz w:val="36"/>
+          <w:szCs w:val="36"/>
+        </w:rPr>
+        <w:lastRenderedPageBreak/>
+        <w:t>Question 2: Explain the different data types in JavaScript. Provide examples for each.</w:t>
+      </w:r>
+    </w:p>
+    <w:p>
+      <w:pPr>
+        <w:ind w:right="-450"/>
+        <w:rPr>
+          <w:rFonts w:asciiTheme="majorBidi" w:hAnsiTheme="majorBidi" w:cstheme="majorBidi"/>
+          <w:b/>
+          <w:bCs/>
+          <w:sz w:val="36"/>
+          <w:szCs w:val="36"/>
+        </w:rPr>
+      </w:pPr>
+      <w:r>
+        <w:rPr>
+          <w:rFonts w:asciiTheme="majorBidi" w:hAnsiTheme="majorBidi" w:cstheme="majorBidi"/>
+          <w:b/>
+          <w:bCs/>
+          <w:sz w:val="36"/>
+          <w:szCs w:val="36"/>
+        </w:rPr>
+        <w:t>Ans:</w:t>
+      </w:r>
+    </w:p>
+    <w:p>
+      <w:pPr>
+        <w:ind w:right="-450"/>
+        <w:rPr>
+          <w:rFonts w:asciiTheme="majorBidi" w:hAnsiTheme="majorBidi" w:cstheme="majorBidi"/>
+          <w:sz w:val="36"/>
+          <w:szCs w:val="36"/>
+        </w:rPr>
+      </w:pPr>
+      <w:r>
+        <w:rPr>
+          <w:rFonts w:asciiTheme="majorBidi" w:hAnsiTheme="majorBidi" w:cstheme="majorBidi"/>
+          <w:sz w:val="36"/>
+          <w:szCs w:val="36"/>
+        </w:rPr>
+        <w:t>JavaScript provides different types of data types that are used to store values. These data types are mainly divided into two categories:</w:t>
+      </w:r>
+    </w:p>
+    <w:p>
+      <w:pPr>
+        <w:numPr>
+          <w:ilvl w:val="0"/>
+          <w:numId w:val="45"/>
+        </w:numPr>
+        <w:ind w:right="-450"/>
+        <w:rPr>
+          <w:rFonts w:asciiTheme="majorBidi" w:hAnsiTheme="majorBidi" w:cstheme="majorBidi"/>
+          <w:sz w:val="36"/>
+          <w:szCs w:val="36"/>
+        </w:rPr>
+      </w:pPr>
+      <w:r>
+        <w:rPr>
+          <w:rFonts w:asciiTheme="majorBidi" w:hAnsiTheme="majorBidi" w:cstheme="majorBidi"/>
+          <w:sz w:val="36"/>
+          <w:szCs w:val="36"/>
+        </w:rPr>
+        <w:t xml:space="preserve">Primitive Data Types </w:t>
+      </w:r>
+    </w:p>
+    <w:p>
+      <w:pPr>
+        <w:numPr>
+          <w:ilvl w:val="0"/>
+          <w:numId w:val="45"/>
+        </w:numPr>
+        <w:ind w:right="-450"/>
+        <w:rPr>
+          <w:rFonts w:asciiTheme="majorBidi" w:hAnsiTheme="majorBidi" w:cstheme="majorBidi"/>
+          <w:sz w:val="36"/>
+          <w:szCs w:val="36"/>
+        </w:rPr>
+      </w:pPr>
+      <w:r>
+        <w:rPr>
+          <w:rFonts w:asciiTheme="majorBidi" w:hAnsiTheme="majorBidi" w:cstheme="majorBidi"/>
+          <w:sz w:val="36"/>
+          <w:szCs w:val="36"/>
+        </w:rPr>
+        <w:t xml:space="preserve">Non-Primitive (Reference) Data Types </w:t>
+      </w:r>
+    </w:p>
+    <w:p>
+      <w:pPr>
+        <w:ind w:right="-450"/>
+        <w:rPr>
+          <w:rFonts w:asciiTheme="majorBidi" w:hAnsiTheme="majorBidi" w:cstheme="majorBidi"/>
+          <w:sz w:val="36"/>
+          <w:szCs w:val="36"/>
+        </w:rPr>
+      </w:pPr>
+      <w:r>
+        <w:rPr>
+          <w:rFonts w:asciiTheme="majorBidi" w:hAnsiTheme="majorBidi" w:cstheme="majorBidi"/>
+          <w:sz w:val="36"/>
+          <w:szCs w:val="36"/>
+        </w:rPr>
+        <w:pict w14:anchorId="79942E96">
+          <v:rect id="_x0000_i1091" style="width:0;height:1.5pt" o:hralign="center" o:hrstd="t" o:hr="t" fillcolor="#a0a0a0" stroked="f"/>
+        </w:pict>
+      </w:r>
+    </w:p>
+    <w:p>
+      <w:pPr>
+        <w:ind w:right="-450"/>
+        <w:rPr>
+          <w:rFonts w:asciiTheme="majorBidi" w:hAnsiTheme="majorBidi" w:cstheme="majorBidi"/>
+          <w:sz w:val="36"/>
+          <w:szCs w:val="36"/>
+        </w:rPr>
+      </w:pPr>
+      <w:r>
+        <w:rPr>
+          <w:rFonts w:asciiTheme="majorBidi" w:hAnsiTheme="majorBidi" w:cstheme="majorBidi"/>
+          <w:sz w:val="36"/>
+          <w:szCs w:val="36"/>
+        </w:rPr>
+        <w:t>1. Primitive Data Types</w:t>
+      </w:r>
+    </w:p>
+    <w:p>
+      <w:pPr>
+        <w:ind w:left="432" w:right="-450"/>
+        <w:rPr>
+          <w:rFonts w:asciiTheme="majorBidi" w:hAnsiTheme="majorBidi" w:cstheme="majorBidi"/>
+          <w:sz w:val="36"/>
+          <w:szCs w:val="36"/>
+        </w:rPr>
+      </w:pPr>
+      <w:r>
+        <w:rPr>
+          <w:rFonts w:asciiTheme="majorBidi" w:hAnsiTheme="majorBidi" w:cstheme="majorBidi"/>
+          <w:sz w:val="36"/>
+          <w:szCs w:val="36"/>
+        </w:rPr>
+        <w:t>Primitive data types store a single value.</w:t>
+      </w:r>
+    </w:p>
+    <w:p>
+      <w:pPr>
+        <w:ind w:right="-450"/>
+        <w:rPr>
+          <w:rFonts w:asciiTheme="majorBidi" w:hAnsiTheme="majorBidi" w:cstheme="majorBidi"/>
+          <w:sz w:val="36"/>
+          <w:szCs w:val="36"/>
+        </w:rPr>
+      </w:pPr>
+      <w:r>
+        <w:rPr>
+          <w:rFonts w:asciiTheme="majorBidi" w:hAnsiTheme="majorBidi" w:cstheme="majorBidi"/>
+          <w:sz w:val="36"/>
+          <w:szCs w:val="36"/>
+        </w:rPr>
+        <w:t>(a) Number</w:t>
+      </w:r>
+    </w:p>
+    <w:p>
+      <w:pPr>
+        <w:numPr>
+          <w:ilvl w:val="0"/>
+          <w:numId w:val="3"/>
+        </w:numPr>
+        <w:tabs>
+          <w:tab w:val="num" w:pos="360"/>
+        </w:tabs>
+        <w:ind w:right="-450"/>
+        <w:rPr>
+          <w:rFonts w:asciiTheme="majorBidi" w:hAnsiTheme="majorBidi" w:cstheme="majorBidi"/>
+          <w:sz w:val="36"/>
+          <w:szCs w:val="36"/>
+        </w:rPr>
+      </w:pPr>
+      <w:r>
+        <w:rPr>
+          <w:rFonts w:asciiTheme="majorBidi" w:hAnsiTheme="majorBidi" w:cstheme="majorBidi"/>
+          <w:sz w:val="36"/>
+          <w:szCs w:val="36"/>
+        </w:rPr>
+        <w:t>The Number data type is used to store numeric values, including integers and decimal numbers.</w:t>
+      </w:r>
+    </w:p>
+    <w:p>
+      <w:pPr>
+        <w:numPr>
+          <w:ilvl w:val="0"/>
+          <w:numId w:val="3"/>
+        </w:numPr>
+        <w:tabs>
+          <w:tab w:val="num" w:pos="360"/>
+        </w:tabs>
+        <w:ind w:right="-450"/>
+        <w:rPr>
+          <w:rFonts w:asciiTheme="majorBidi" w:hAnsiTheme="majorBidi" w:cstheme="majorBidi"/>
+          <w:sz w:val="36"/>
+          <w:szCs w:val="36"/>
+        </w:rPr>
+      </w:pPr>
+      <w:r>
+        <w:rPr>
+          <w:rFonts w:asciiTheme="majorBidi" w:hAnsiTheme="majorBidi" w:cstheme="majorBidi"/>
+          <w:sz w:val="36"/>
+          <w:szCs w:val="36"/>
+        </w:rPr>
+        <w:t>Example:</w:t>
+      </w:r>
+    </w:p>
+    <w:p>
+      <w:pPr>
+        <w:ind w:right="-450"/>
+        <w:rPr>
+          <w:rFonts w:asciiTheme="majorBidi" w:hAnsiTheme="majorBidi" w:cstheme="majorBidi"/>
+          <w:sz w:val="36"/>
+          <w:szCs w:val="36"/>
+        </w:rPr>
+      </w:pPr>
+      <w:r>
+        <w:rPr>
+          <w:rFonts w:asciiTheme="majorBidi" w:hAnsiTheme="majorBidi" w:cstheme="majorBidi"/>
+          <w:sz w:val="36"/>
+          <w:szCs w:val="36"/>
+        </w:rPr>
+        <w:t>let age = 23;</w:t>
+      </w:r>
+      <w:r>
+        <w:rPr>
+          <w:rFonts w:asciiTheme="majorBidi" w:hAnsiTheme="majorBidi" w:cstheme="majorBidi"/>
+          <w:sz w:val="36"/>
+          <w:szCs w:val="36"/>
+        </w:rPr>
+        <w:br/>
+        <w:t>let price = 99.99;</w:t>
+      </w:r>
+      <w:r>
+        <w:rPr>
+          <w:rFonts w:asciiTheme="majorBidi" w:hAnsiTheme="majorBidi" w:cstheme="majorBidi"/>
+          <w:sz w:val="36"/>
+          <w:szCs w:val="36"/>
+        </w:rPr>
+        <w:br/>
+      </w:r>
+      <w:r>
+        <w:rPr>
+          <w:rFonts w:asciiTheme="majorBidi" w:hAnsiTheme="majorBidi" w:cstheme="majorBidi"/>
+          <w:sz w:val="36"/>
+          <w:szCs w:val="36"/>
+        </w:rPr>
+        <w:br/>
+        <w:t>console.log(age);</w:t>
+      </w:r>
+      <w:r>
+        <w:rPr>
+          <w:rFonts w:asciiTheme="majorBidi" w:hAnsiTheme="majorBidi" w:cstheme="majorBidi"/>
+          <w:sz w:val="36"/>
+          <w:szCs w:val="36"/>
+        </w:rPr>
+        <w:br/>
+        <w:t>console.log(price);</w:t>
+      </w:r>
+    </w:p>
+    <w:p>
+      <w:pPr>
+        <w:ind w:right="-450"/>
+        <w:rPr>
+          <w:rFonts w:asciiTheme="majorBidi" w:hAnsiTheme="majorBidi" w:cstheme="majorBidi"/>
+          <w:sz w:val="36"/>
+          <w:szCs w:val="36"/>
+        </w:rPr>
+      </w:pPr>
+    </w:p>
+    <w:p>
+      <w:pPr>
+        <w:ind w:right="-450"/>
+        <w:rPr>
+          <w:rFonts w:asciiTheme="majorBidi" w:hAnsiTheme="majorBidi" w:cstheme="majorBidi"/>
+          <w:sz w:val="36"/>
+          <w:szCs w:val="36"/>
+        </w:rPr>
+      </w:pPr>
+      <w:r>
+        <w:rPr>
+          <w:rFonts w:asciiTheme="majorBidi" w:hAnsiTheme="majorBidi" w:cstheme="majorBidi"/>
+          <w:sz w:val="36"/>
+          <w:szCs w:val="36"/>
+        </w:rPr>
+        <w:t>(b) String</w:t>
+      </w:r>
+    </w:p>
+    <w:p>
+      <w:pPr>
+        <w:ind w:right="-450"/>
+        <w:rPr>
+          <w:rFonts w:asciiTheme="majorBidi" w:hAnsiTheme="majorBidi" w:cstheme="majorBidi"/>
+          <w:sz w:val="36"/>
+          <w:szCs w:val="36"/>
+        </w:rPr>
+      </w:pPr>
+      <w:r>
+        <w:rPr>
+          <w:rFonts w:asciiTheme="majorBidi" w:hAnsiTheme="majorBidi" w:cstheme="majorBidi"/>
+          <w:sz w:val="36"/>
+          <w:szCs w:val="36"/>
+        </w:rPr>
+        <w:t xml:space="preserve">      </w:t>
+      </w:r>
+      <w:r>
+        <w:rPr>
+          <w:rFonts w:asciiTheme="majorBidi" w:hAnsiTheme="majorBidi" w:cstheme="majorBidi"/>
+          <w:sz w:val="36"/>
+          <w:szCs w:val="36"/>
+        </w:rPr>
+        <w:t>The String data type is used to store text values.</w:t>
+      </w:r>
+    </w:p>
+    <w:p>
+      <w:pPr>
+        <w:ind w:right="-450"/>
+        <w:rPr>
+          <w:rFonts w:asciiTheme="majorBidi" w:hAnsiTheme="majorBidi" w:cstheme="majorBidi"/>
+          <w:sz w:val="36"/>
+          <w:szCs w:val="36"/>
+        </w:rPr>
+      </w:pPr>
+      <w:r>
+        <w:rPr>
+          <w:rFonts w:asciiTheme="majorBidi" w:hAnsiTheme="majorBidi" w:cstheme="majorBidi"/>
+          <w:sz w:val="36"/>
+          <w:szCs w:val="36"/>
+        </w:rPr>
+        <w:lastRenderedPageBreak/>
+        <w:t>Example:</w:t>
+      </w:r>
+    </w:p>
+    <w:p>
+      <w:pPr>
+        <w:ind w:right="-450"/>
+        <w:rPr>
+          <w:rFonts w:asciiTheme="majorBidi" w:hAnsiTheme="majorBidi" w:cstheme="majorBidi"/>
+          <w:sz w:val="36"/>
+          <w:szCs w:val="36"/>
+        </w:rPr>
+      </w:pPr>
+      <w:r>
+        <w:rPr>
+          <w:rFonts w:asciiTheme="majorBidi" w:hAnsiTheme="majorBidi" w:cstheme="majorBidi"/>
+          <w:sz w:val="36"/>
+          <w:szCs w:val="36"/>
+        </w:rPr>
+        <w:t>let name = "Shreyansh";</w:t>
+      </w:r>
+      <w:r>
+        <w:rPr>
+          <w:rFonts w:asciiTheme="majorBidi" w:hAnsiTheme="majorBidi" w:cstheme="majorBidi"/>
+          <w:sz w:val="36"/>
+          <w:szCs w:val="36"/>
+        </w:rPr>
+        <w:br/>
+        <w:t>let city = 'Rajkot';</w:t>
+      </w:r>
+      <w:r>
+        <w:rPr>
+          <w:rFonts w:asciiTheme="majorBidi" w:hAnsiTheme="majorBidi" w:cstheme="majorBidi"/>
+          <w:sz w:val="36"/>
+          <w:szCs w:val="36"/>
+        </w:rPr>
+        <w:br/>
+      </w:r>
+      <w:r>
+        <w:rPr>
+          <w:rFonts w:asciiTheme="majorBidi" w:hAnsiTheme="majorBidi" w:cstheme="majorBidi"/>
+          <w:sz w:val="36"/>
+          <w:szCs w:val="36"/>
+        </w:rPr>
+        <w:br/>
+        <w:t>console.log(name);</w:t>
+      </w:r>
+      <w:r>
+        <w:rPr>
+          <w:rFonts w:asciiTheme="majorBidi" w:hAnsiTheme="majorBidi" w:cstheme="majorBidi"/>
+          <w:sz w:val="36"/>
+          <w:szCs w:val="36"/>
+        </w:rPr>
+        <w:br/>
+        <w:t>console.log(city);</w:t>
+      </w:r>
+    </w:p>
+    <w:p>
+      <w:pPr>
+        <w:ind w:right="-450"/>
+        <w:rPr>
+          <w:rFonts w:asciiTheme="majorBidi" w:hAnsiTheme="majorBidi" w:cstheme="majorBidi"/>
+          <w:sz w:val="36"/>
+          <w:szCs w:val="36"/>
+        </w:rPr>
+      </w:pPr>
+    </w:p>
+    <w:p>
+      <w:pPr>
+        <w:ind w:right="-450"/>
+        <w:rPr>
+          <w:rFonts w:asciiTheme="majorBidi" w:hAnsiTheme="majorBidi" w:cstheme="majorBidi"/>
+          <w:sz w:val="36"/>
+          <w:szCs w:val="36"/>
+        </w:rPr>
+      </w:pPr>
+      <w:r>
+        <w:rPr>
+          <w:rFonts w:asciiTheme="majorBidi" w:hAnsiTheme="majorBidi" w:cstheme="majorBidi"/>
+          <w:sz w:val="36"/>
+          <w:szCs w:val="36"/>
+        </w:rPr>
+        <w:t>(c) Boolean</w:t>
+      </w:r>
+    </w:p>
+    <w:p>
+      <w:pPr>
+        <w:ind w:left="432" w:right="-450"/>
+        <w:rPr>
+          <w:rFonts w:asciiTheme="majorBidi" w:hAnsiTheme="majorBidi" w:cstheme="majorBidi"/>
+          <w:sz w:val="36"/>
+          <w:szCs w:val="36"/>
+        </w:rPr>
+      </w:pPr>
+      <w:r>
+        <w:rPr>
+          <w:rFonts w:asciiTheme="majorBidi" w:hAnsiTheme="majorBidi" w:cstheme="majorBidi"/>
+          <w:sz w:val="36"/>
+          <w:szCs w:val="36"/>
+        </w:rPr>
+        <w:t>The Boolean data type stores only two values: true or false.</w:t>
+      </w:r>
+    </w:p>
+    <w:p>
+      <w:pPr>
+        <w:ind w:right="-450"/>
+        <w:rPr>
+          <w:rFonts w:asciiTheme="majorBidi" w:hAnsiTheme="majorBidi" w:cstheme="majorBidi"/>
+          <w:sz w:val="36"/>
+          <w:szCs w:val="36"/>
+        </w:rPr>
+      </w:pPr>
+      <w:r>
+        <w:rPr>
+          <w:rFonts w:asciiTheme="majorBidi" w:hAnsiTheme="majorBidi" w:cstheme="majorBidi"/>
+          <w:sz w:val="36"/>
+          <w:szCs w:val="36"/>
+        </w:rPr>
+        <w:t xml:space="preserve">     </w:t>
+      </w:r>
+      <w:r>
+        <w:rPr>
+          <w:rFonts w:asciiTheme="majorBidi" w:hAnsiTheme="majorBidi" w:cstheme="majorBidi"/>
+          <w:sz w:val="36"/>
+          <w:szCs w:val="36"/>
+        </w:rPr>
+        <w:t>Example:</w:t>
+      </w:r>
+    </w:p>
+    <w:p>
+      <w:pPr>
+        <w:ind w:right="-450"/>
+        <w:rPr>
+          <w:rFonts w:asciiTheme="majorBidi" w:hAnsiTheme="majorBidi" w:cstheme="majorBidi"/>
+          <w:sz w:val="36"/>
+          <w:szCs w:val="36"/>
+        </w:rPr>
+      </w:pPr>
+      <w:r>
+        <w:rPr>
+          <w:rFonts w:asciiTheme="majorBidi" w:hAnsiTheme="majorBidi" w:cstheme="majorBidi"/>
+          <w:sz w:val="36"/>
+          <w:szCs w:val="36"/>
+        </w:rPr>
+        <w:t xml:space="preserve">let </w:t>
+      </w:r>
+      <w:proofErr w:type="spellStart"/>
+      <w:r>
+        <w:rPr>
+          <w:rFonts w:asciiTheme="majorBidi" w:hAnsiTheme="majorBidi" w:cstheme="majorBidi"/>
+          <w:sz w:val="36"/>
+          <w:szCs w:val="36"/>
+        </w:rPr>
+        <w:t>isLogin</w:t>
+      </w:r>
+      <w:proofErr w:type="spellEnd"/>
+      <w:r>
+        <w:rPr>
+          <w:rFonts w:asciiTheme="majorBidi" w:hAnsiTheme="majorBidi" w:cstheme="majorBidi"/>
+          <w:sz w:val="36"/>
+          <w:szCs w:val="36"/>
+        </w:rPr>
+        <w:t xml:space="preserve"> = true;</w:t>
+      </w:r>
+      <w:r>
+        <w:rPr>
+          <w:rFonts w:asciiTheme="majorBidi" w:hAnsiTheme="majorBidi" w:cstheme="majorBidi"/>
+          <w:sz w:val="36"/>
+          <w:szCs w:val="36"/>
+        </w:rPr>
+        <w:br/>
+        <w:t xml:space="preserve">let </w:t>
+      </w:r>
+      <w:proofErr w:type="spellStart"/>
+      <w:r>
+        <w:rPr>
+          <w:rFonts w:asciiTheme="majorBidi" w:hAnsiTheme="majorBidi" w:cstheme="majorBidi"/>
+          <w:sz w:val="36"/>
+          <w:szCs w:val="36"/>
+        </w:rPr>
+        <w:t>isAdmin</w:t>
+      </w:r>
+      <w:proofErr w:type="spellEnd"/>
+      <w:r>
+        <w:rPr>
+          <w:rFonts w:asciiTheme="majorBidi" w:hAnsiTheme="majorBidi" w:cstheme="majorBidi"/>
+          <w:sz w:val="36"/>
+          <w:szCs w:val="36"/>
+        </w:rPr>
+        <w:t xml:space="preserve"> = false;</w:t>
+      </w:r>
+      <w:r>
+        <w:rPr>
+          <w:rFonts w:asciiTheme="majorBidi" w:hAnsiTheme="majorBidi" w:cstheme="majorBidi"/>
+          <w:sz w:val="36"/>
+          <w:szCs w:val="36"/>
+        </w:rPr>
+        <w:br/>
+      </w:r>
+      <w:r>
+        <w:rPr>
+          <w:rFonts w:asciiTheme="majorBidi" w:hAnsiTheme="majorBidi" w:cstheme="majorBidi"/>
+          <w:sz w:val="36"/>
+          <w:szCs w:val="36"/>
+        </w:rPr>
+        <w:br/>
+        <w:t>console.log(</w:t>
+      </w:r>
+      <w:proofErr w:type="spellStart"/>
+      <w:r>
+        <w:rPr>
+          <w:rFonts w:asciiTheme="majorBidi" w:hAnsiTheme="majorBidi" w:cstheme="majorBidi"/>
+          <w:sz w:val="36"/>
+          <w:szCs w:val="36"/>
+        </w:rPr>
+        <w:t>isLogin</w:t>
+      </w:r>
+      <w:proofErr w:type="spellEnd"/>
+      <w:r>
+        <w:rPr>
+          <w:rFonts w:asciiTheme="majorBidi" w:hAnsiTheme="majorBidi" w:cstheme="majorBidi"/>
+          <w:sz w:val="36"/>
+          <w:szCs w:val="36"/>
+        </w:rPr>
+        <w:t>);</w:t>
+      </w:r>
+      <w:r>
+        <w:rPr>
+          <w:rFonts w:asciiTheme="majorBidi" w:hAnsiTheme="majorBidi" w:cstheme="majorBidi"/>
+          <w:sz w:val="36"/>
+          <w:szCs w:val="36"/>
+        </w:rPr>
+        <w:br/>
+        <w:t>console.log(</w:t>
+      </w:r>
+      <w:proofErr w:type="spellStart"/>
+      <w:r>
+        <w:rPr>
+          <w:rFonts w:asciiTheme="majorBidi" w:hAnsiTheme="majorBidi" w:cstheme="majorBidi"/>
+          <w:sz w:val="36"/>
+          <w:szCs w:val="36"/>
+        </w:rPr>
+        <w:t>isAdmin</w:t>
+      </w:r>
+      <w:proofErr w:type="spellEnd"/>
+      <w:r>
+        <w:rPr>
+          <w:rFonts w:asciiTheme="majorBidi" w:hAnsiTheme="majorBidi" w:cstheme="majorBidi"/>
+          <w:sz w:val="36"/>
+          <w:szCs w:val="36"/>
+        </w:rPr>
+        <w:t>);</w:t>
+      </w:r>
+    </w:p>
+    <w:p>
+      <w:pPr>
+        <w:ind w:right="-450"/>
+        <w:rPr>
+          <w:rFonts w:asciiTheme="majorBidi" w:hAnsiTheme="majorBidi" w:cstheme="majorBidi"/>
+          <w:sz w:val="36"/>
+          <w:szCs w:val="36"/>
+        </w:rPr>
+      </w:pPr>
+    </w:p>
+    <w:p>
+      <w:pPr>
+        <w:ind w:right="-450"/>
+        <w:rPr>
+          <w:rFonts w:asciiTheme="majorBidi" w:hAnsiTheme="majorBidi" w:cstheme="majorBidi"/>
+          <w:sz w:val="36"/>
+          <w:szCs w:val="36"/>
+        </w:rPr>
+      </w:pPr>
+      <w:r>
+        <w:rPr>
+          <w:rFonts w:asciiTheme="majorBidi" w:hAnsiTheme="majorBidi" w:cstheme="majorBidi"/>
+          <w:sz w:val="36"/>
+          <w:szCs w:val="36"/>
+        </w:rPr>
+        <w:t>(d) Undefined</w:t>
+      </w:r>
+    </w:p>
+    <w:p>
+      <w:pPr>
+        <w:ind w:right="-450"/>
+        <w:rPr>
+          <w:rFonts w:asciiTheme="majorBidi" w:hAnsiTheme="majorBidi" w:cstheme="majorBidi"/>
+          <w:sz w:val="36"/>
+          <w:szCs w:val="36"/>
+        </w:rPr>
+      </w:pPr>
+      <w:r>
+        <w:rPr>
+          <w:rFonts w:asciiTheme="majorBidi" w:hAnsiTheme="majorBidi" w:cstheme="majorBidi"/>
+          <w:sz w:val="36"/>
+          <w:szCs w:val="36"/>
+        </w:rPr>
+        <w:t xml:space="preserve">          </w:t>
+      </w:r>
+      <w:r>
+        <w:rPr>
+          <w:rFonts w:asciiTheme="majorBidi" w:hAnsiTheme="majorBidi" w:cstheme="majorBidi"/>
+          <w:sz w:val="36"/>
+          <w:szCs w:val="36"/>
+        </w:rPr>
+        <w:t>A variable that is declared but not assigned any value has the data type Undefined.</w:t>
+      </w:r>
+    </w:p>
+    <w:p>
+      <w:pPr>
+        <w:ind w:right="-450"/>
+        <w:rPr>
+          <w:rFonts w:asciiTheme="majorBidi" w:hAnsiTheme="majorBidi" w:cstheme="majorBidi"/>
+          <w:sz w:val="36"/>
+          <w:szCs w:val="36"/>
+        </w:rPr>
+      </w:pPr>
+      <w:r>
+        <w:rPr>
+          <w:rFonts w:asciiTheme="majorBidi" w:hAnsiTheme="majorBidi" w:cstheme="majorBidi"/>
+          <w:sz w:val="36"/>
+          <w:szCs w:val="36"/>
+        </w:rPr>
+        <w:t>Example:</w:t>
+      </w:r>
+    </w:p>
+    <w:p>
+      <w:pPr>
+        <w:ind w:right="-450"/>
+        <w:rPr>
+          <w:rFonts w:asciiTheme="majorBidi" w:hAnsiTheme="majorBidi" w:cstheme="majorBidi"/>
+          <w:sz w:val="36"/>
+          <w:szCs w:val="36"/>
+        </w:rPr>
+      </w:pPr>
+      <w:r>
+        <w:rPr>
+          <w:rFonts w:asciiTheme="majorBidi" w:hAnsiTheme="majorBidi" w:cstheme="majorBidi"/>
+          <w:sz w:val="36"/>
+          <w:szCs w:val="36"/>
+        </w:rPr>
+        <w:t>let x;</w:t>
+      </w:r>
+      <w:r>
+        <w:rPr>
+          <w:rFonts w:asciiTheme="majorBidi" w:hAnsiTheme="majorBidi" w:cstheme="majorBidi"/>
+          <w:sz w:val="36"/>
+          <w:szCs w:val="36"/>
+        </w:rPr>
+        <w:br/>
+      </w:r>
+      <w:r>
+        <w:rPr>
+          <w:rFonts w:asciiTheme="majorBidi" w:hAnsiTheme="majorBidi" w:cstheme="majorBidi"/>
+          <w:sz w:val="36"/>
+          <w:szCs w:val="36"/>
+        </w:rPr>
+        <w:br/>
+        <w:t>console.log(x);</w:t>
+      </w:r>
+    </w:p>
+    <w:p>
+      <w:pPr>
+        <w:ind w:right="-450"/>
+        <w:rPr>
+          <w:rFonts w:asciiTheme="majorBidi" w:hAnsiTheme="majorBidi" w:cstheme="majorBidi"/>
+          <w:sz w:val="36"/>
+          <w:szCs w:val="36"/>
+        </w:rPr>
+      </w:pPr>
+      <w:r>
+        <w:rPr>
+          <w:rFonts w:asciiTheme="majorBidi" w:hAnsiTheme="majorBidi" w:cstheme="majorBidi"/>
+          <w:sz w:val="36"/>
+          <w:szCs w:val="36"/>
+        </w:rPr>
+        <w:t>Output:</w:t>
+      </w:r>
+    </w:p>
+    <w:p>
+      <w:pPr>
+        <w:ind w:right="-450"/>
+        <w:rPr>
+          <w:rFonts w:asciiTheme="majorBidi" w:hAnsiTheme="majorBidi" w:cstheme="majorBidi"/>
+          <w:sz w:val="36"/>
+          <w:szCs w:val="36"/>
+        </w:rPr>
+      </w:pPr>
+      <w:r>
+        <w:rPr>
+          <w:rFonts w:asciiTheme="majorBidi" w:hAnsiTheme="majorBidi" w:cstheme="majorBidi"/>
+          <w:sz w:val="36"/>
+          <w:szCs w:val="36"/>
+        </w:rPr>
+        <w:lastRenderedPageBreak/>
+        <w:t>undefined</w:t>
+      </w:r>
+    </w:p>
+    <w:p>
+      <w:pPr>
+        <w:ind w:right="-450"/>
+        <w:rPr>
+          <w:rFonts w:asciiTheme="majorBidi" w:hAnsiTheme="majorBidi" w:cstheme="majorBidi"/>
+          <w:sz w:val="36"/>
+          <w:szCs w:val="36"/>
+        </w:rPr>
+      </w:pPr>
+    </w:p>
+    <w:p>
+      <w:pPr>
+        <w:ind w:right="-450"/>
+        <w:rPr>
+          <w:rFonts w:asciiTheme="majorBidi" w:hAnsiTheme="majorBidi" w:cstheme="majorBidi"/>
+          <w:sz w:val="36"/>
+          <w:szCs w:val="36"/>
+        </w:rPr>
+      </w:pPr>
+      <w:r>
+        <w:rPr>
+          <w:rFonts w:asciiTheme="majorBidi" w:hAnsiTheme="majorBidi" w:cstheme="majorBidi"/>
+          <w:sz w:val="36"/>
+          <w:szCs w:val="36"/>
+        </w:rPr>
+        <w:t>(e) Null</w:t>
+      </w:r>
+    </w:p>
+    <w:p>
+      <w:pPr>
+        <w:ind w:right="-450"/>
+        <w:rPr>
+          <w:rFonts w:asciiTheme="majorBidi" w:hAnsiTheme="majorBidi" w:cstheme="majorBidi"/>
+          <w:sz w:val="36"/>
+          <w:szCs w:val="36"/>
+        </w:rPr>
+      </w:pPr>
+      <w:r>
+        <w:rPr>
+          <w:rFonts w:asciiTheme="majorBidi" w:hAnsiTheme="majorBidi" w:cstheme="majorBidi"/>
+          <w:sz w:val="36"/>
+          <w:szCs w:val="36"/>
+        </w:rPr>
+        <w:t>The Null data type represents an empty or unknown value.</w:t>
+      </w:r>
+    </w:p>
+    <w:p>
+      <w:pPr>
+        <w:ind w:right="-450"/>
+        <w:rPr>
+          <w:rFonts w:asciiTheme="majorBidi" w:hAnsiTheme="majorBidi" w:cstheme="majorBidi"/>
+          <w:sz w:val="36"/>
+          <w:szCs w:val="36"/>
+        </w:rPr>
+      </w:pPr>
+      <w:r>
+        <w:rPr>
+          <w:rFonts w:asciiTheme="majorBidi" w:hAnsiTheme="majorBidi" w:cstheme="majorBidi"/>
+          <w:sz w:val="36"/>
+          <w:szCs w:val="36"/>
+        </w:rPr>
+        <w:t>Example:</w:t>
+      </w:r>
+    </w:p>
+    <w:p>
+      <w:pPr>
+        <w:ind w:right="-450"/>
+        <w:rPr>
+          <w:rFonts w:asciiTheme="majorBidi" w:hAnsiTheme="majorBidi" w:cstheme="majorBidi"/>
+          <w:sz w:val="36"/>
+          <w:szCs w:val="36"/>
+        </w:rPr>
+      </w:pPr>
+      <w:r>
+        <w:rPr>
+          <w:rFonts w:asciiTheme="majorBidi" w:hAnsiTheme="majorBidi" w:cstheme="majorBidi"/>
+          <w:sz w:val="36"/>
+          <w:szCs w:val="36"/>
+        </w:rPr>
+        <w:t>let data = null;</w:t>
+      </w:r>
+      <w:r>
+        <w:rPr>
+          <w:rFonts w:asciiTheme="majorBidi" w:hAnsiTheme="majorBidi" w:cstheme="majorBidi"/>
+          <w:sz w:val="36"/>
+          <w:szCs w:val="36"/>
+        </w:rPr>
+        <w:br/>
+      </w:r>
+      <w:r>
+        <w:rPr>
+          <w:rFonts w:asciiTheme="majorBidi" w:hAnsiTheme="majorBidi" w:cstheme="majorBidi"/>
+          <w:sz w:val="36"/>
+          <w:szCs w:val="36"/>
+        </w:rPr>
+        <w:br/>
+        <w:t>console.log(data);</w:t>
+      </w:r>
+    </w:p>
+    <w:p>
+      <w:pPr>
+        <w:ind w:right="-450"/>
+        <w:rPr>
+          <w:rFonts w:asciiTheme="majorBidi" w:hAnsiTheme="majorBidi" w:cstheme="majorBidi"/>
+          <w:sz w:val="36"/>
+          <w:szCs w:val="36"/>
+        </w:rPr>
+      </w:pPr>
+      <w:r>
+        <w:rPr>
+          <w:rFonts w:asciiTheme="majorBidi" w:hAnsiTheme="majorBidi" w:cstheme="majorBidi"/>
+          <w:sz w:val="36"/>
+          <w:szCs w:val="36"/>
+        </w:rPr>
+        <w:pict w14:anchorId="268DB4F0">
+          <v:rect id="_x0000_i1096" style="width:0;height:1.5pt" o:hralign="center" o:hrstd="t" o:hr="t" fillcolor="#a0a0a0" stroked="f"/>
+        </w:pict>
+      </w:r>
+    </w:p>
+    <w:p>
+      <w:pPr>
+        <w:ind w:right="-450"/>
+        <w:rPr>
+          <w:rFonts w:asciiTheme="majorBidi" w:hAnsiTheme="majorBidi" w:cstheme="majorBidi"/>
+          <w:sz w:val="36"/>
+          <w:szCs w:val="36"/>
+        </w:rPr>
+      </w:pPr>
+      <w:r>
+        <w:rPr>
+          <w:rFonts w:asciiTheme="majorBidi" w:hAnsiTheme="majorBidi" w:cstheme="majorBidi"/>
+          <w:sz w:val="36"/>
+          <w:szCs w:val="36"/>
+        </w:rPr>
+        <w:t xml:space="preserve">(f) </w:t>
+      </w:r>
+      <w:proofErr w:type="spellStart"/>
+      <w:r>
+        <w:rPr>
+          <w:rFonts w:asciiTheme="majorBidi" w:hAnsiTheme="majorBidi" w:cstheme="majorBidi"/>
+          <w:sz w:val="36"/>
+          <w:szCs w:val="36"/>
+        </w:rPr>
+        <w:t>BigInt</w:t>
+      </w:r>
+      <w:proofErr w:type="spellEnd"/>
+    </w:p>
+    <w:p>
+      <w:pPr>
+        <w:ind w:right="-450"/>
+        <w:rPr>
+          <w:rFonts w:asciiTheme="majorBidi" w:hAnsiTheme="majorBidi" w:cstheme="majorBidi"/>
+          <w:sz w:val="36"/>
+          <w:szCs w:val="36"/>
+        </w:rPr>
+      </w:pPr>
+      <w:proofErr w:type="spellStart"/>
+      <w:r>
+        <w:rPr>
+          <w:rFonts w:asciiTheme="majorBidi" w:hAnsiTheme="majorBidi" w:cstheme="majorBidi"/>
+          <w:sz w:val="36"/>
+          <w:szCs w:val="36"/>
+        </w:rPr>
+        <w:t>BigInt</w:t>
+      </w:r>
+      <w:proofErr w:type="spellEnd"/>
+      <w:r>
+        <w:rPr>
+          <w:rFonts w:asciiTheme="majorBidi" w:hAnsiTheme="majorBidi" w:cstheme="majorBidi"/>
+          <w:sz w:val="36"/>
+          <w:szCs w:val="36"/>
+        </w:rPr>
+        <w:t xml:space="preserve"> is used to store very large integer values.</w:t>
+      </w:r>
+    </w:p>
+    <w:p>
+      <w:pPr>
+        <w:ind w:right="-450"/>
+        <w:rPr>
+          <w:rFonts w:asciiTheme="majorBidi" w:hAnsiTheme="majorBidi" w:cstheme="majorBidi"/>
+          <w:sz w:val="36"/>
+          <w:szCs w:val="36"/>
+        </w:rPr>
+      </w:pPr>
+      <w:r>
+        <w:rPr>
+          <w:rFonts w:asciiTheme="majorBidi" w:hAnsiTheme="majorBidi" w:cstheme="majorBidi"/>
+          <w:sz w:val="36"/>
+          <w:szCs w:val="36"/>
+        </w:rPr>
+        <w:t>Example:</w:t>
+      </w:r>
+    </w:p>
+    <w:p>
+      <w:pPr>
+        <w:ind w:right="-450"/>
+        <w:rPr>
+          <w:rFonts w:asciiTheme="majorBidi" w:hAnsiTheme="majorBidi" w:cstheme="majorBidi"/>
+          <w:sz w:val="36"/>
+          <w:szCs w:val="36"/>
+        </w:rPr>
+      </w:pPr>
+      <w:r>
+        <w:rPr>
+          <w:rFonts w:asciiTheme="majorBidi" w:hAnsiTheme="majorBidi" w:cstheme="majorBidi"/>
+          <w:sz w:val="36"/>
+          <w:szCs w:val="36"/>
+        </w:rPr>
+        <w:t xml:space="preserve">let </w:t>
+      </w:r>
+      <w:proofErr w:type="spellStart"/>
+      <w:r>
+        <w:rPr>
+          <w:rFonts w:asciiTheme="majorBidi" w:hAnsiTheme="majorBidi" w:cstheme="majorBidi"/>
+          <w:sz w:val="36"/>
+          <w:szCs w:val="36"/>
+        </w:rPr>
+        <w:t>bigNumber</w:t>
+      </w:r>
+      <w:proofErr w:type="spellEnd"/>
+      <w:r>
+        <w:rPr>
+          <w:rFonts w:asciiTheme="majorBidi" w:hAnsiTheme="majorBidi" w:cstheme="majorBidi"/>
+          <w:sz w:val="36"/>
+          <w:szCs w:val="36"/>
+        </w:rPr>
+        <w:t xml:space="preserve"> = 123456789123456789123456789n;</w:t>
+      </w:r>
+      <w:r>
+        <w:rPr>
+          <w:rFonts w:asciiTheme="majorBidi" w:hAnsiTheme="majorBidi" w:cstheme="majorBidi"/>
+          <w:sz w:val="36"/>
+          <w:szCs w:val="36"/>
+        </w:rPr>
+        <w:br/>
+      </w:r>
+      <w:r>
+        <w:rPr>
+          <w:rFonts w:asciiTheme="majorBidi" w:hAnsiTheme="majorBidi" w:cstheme="majorBidi"/>
+          <w:sz w:val="36"/>
+          <w:szCs w:val="36"/>
+        </w:rPr>
+        <w:br/>
+        <w:t>console.log(</w:t>
+      </w:r>
+      <w:proofErr w:type="spellStart"/>
+      <w:r>
+        <w:rPr>
+          <w:rFonts w:asciiTheme="majorBidi" w:hAnsiTheme="majorBidi" w:cstheme="majorBidi"/>
+          <w:sz w:val="36"/>
+          <w:szCs w:val="36"/>
+        </w:rPr>
+        <w:t>bigNumber</w:t>
+      </w:r>
+      <w:proofErr w:type="spellEnd"/>
+      <w:r>
+        <w:rPr>
+          <w:rFonts w:asciiTheme="majorBidi" w:hAnsiTheme="majorBidi" w:cstheme="majorBidi"/>
+          <w:sz w:val="36"/>
+          <w:szCs w:val="36"/>
+        </w:rPr>
+        <w:t>);</w:t>
+      </w:r>
+    </w:p>
+    <w:p>
+      <w:pPr>
+        <w:ind w:right="-450"/>
+        <w:rPr>
+          <w:rFonts w:asciiTheme="majorBidi" w:hAnsiTheme="majorBidi" w:cstheme="majorBidi"/>
+          <w:sz w:val="36"/>
+          <w:szCs w:val="36"/>
+        </w:rPr>
+      </w:pPr>
+      <w:r>
+        <w:rPr>
+          <w:rFonts w:asciiTheme="majorBidi" w:hAnsiTheme="majorBidi" w:cstheme="majorBidi"/>
+          <w:sz w:val="36"/>
+          <w:szCs w:val="36"/>
+        </w:rPr>
+        <w:pict w14:anchorId="25633088">
+          <v:rect id="_x0000_i1097" style="width:0;height:1.5pt" o:hralign="center" o:hrstd="t" o:hr="t" fillcolor="#a0a0a0" stroked="f"/>
+        </w:pict>
+      </w:r>
+    </w:p>
+    <w:p>
+      <w:pPr>
+        <w:ind w:right="-450"/>
+        <w:rPr>
+          <w:rFonts w:asciiTheme="majorBidi" w:hAnsiTheme="majorBidi" w:cstheme="majorBidi"/>
+          <w:sz w:val="36"/>
+          <w:szCs w:val="36"/>
+        </w:rPr>
+      </w:pPr>
+      <w:r>
+        <w:rPr>
+          <w:rFonts w:asciiTheme="majorBidi" w:hAnsiTheme="majorBidi" w:cstheme="majorBidi"/>
+          <w:sz w:val="36"/>
+          <w:szCs w:val="36"/>
+        </w:rPr>
+        <w:t>(g) Symbol</w:t>
+      </w:r>
+    </w:p>
+    <w:p>
+      <w:pPr>
+        <w:ind w:right="-450"/>
+        <w:rPr>
+          <w:rFonts w:asciiTheme="majorBidi" w:hAnsiTheme="majorBidi" w:cstheme="majorBidi"/>
+          <w:sz w:val="36"/>
+          <w:szCs w:val="36"/>
+        </w:rPr>
+      </w:pPr>
+      <w:r>
+        <w:rPr>
+          <w:rFonts w:asciiTheme="majorBidi" w:hAnsiTheme="majorBidi" w:cstheme="majorBidi"/>
+          <w:sz w:val="36"/>
+          <w:szCs w:val="36"/>
+        </w:rPr>
+        <w:t>The Symbol data type is used to create unique identifiers.</w:t>
+      </w:r>
+    </w:p>
+    <w:p>
+      <w:pPr>
+        <w:ind w:right="-450"/>
+        <w:rPr>
+          <w:rFonts w:asciiTheme="majorBidi" w:hAnsiTheme="majorBidi" w:cstheme="majorBidi"/>
+          <w:sz w:val="36"/>
+          <w:szCs w:val="36"/>
+        </w:rPr>
+      </w:pPr>
+      <w:r>
+        <w:rPr>
+          <w:rFonts w:asciiTheme="majorBidi" w:hAnsiTheme="majorBidi" w:cstheme="majorBidi"/>
+          <w:sz w:val="36"/>
+          <w:szCs w:val="36"/>
+        </w:rPr>
+        <w:t>Example:</w:t>
+      </w:r>
+    </w:p>
+    <w:p>
+      <w:pPr>
+        <w:ind w:right="-450"/>
+        <w:rPr>
+          <w:rFonts w:asciiTheme="majorBidi" w:hAnsiTheme="majorBidi" w:cstheme="majorBidi"/>
+          <w:sz w:val="36"/>
+          <w:szCs w:val="36"/>
+        </w:rPr>
+      </w:pPr>
+      <w:r>
+        <w:rPr>
+          <w:rFonts w:asciiTheme="majorBidi" w:hAnsiTheme="majorBidi" w:cstheme="majorBidi"/>
+          <w:sz w:val="36"/>
+          <w:szCs w:val="36"/>
+        </w:rPr>
+        <w:t>let id = Symbol("id");</w:t>
+      </w:r>
+      <w:r>
+        <w:rPr>
+          <w:rFonts w:asciiTheme="majorBidi" w:hAnsiTheme="majorBidi" w:cstheme="majorBidi"/>
+          <w:sz w:val="36"/>
+          <w:szCs w:val="36"/>
+        </w:rPr>
+        <w:br/>
+      </w:r>
+      <w:r>
+        <w:rPr>
+          <w:rFonts w:asciiTheme="majorBidi" w:hAnsiTheme="majorBidi" w:cstheme="majorBidi"/>
+          <w:sz w:val="36"/>
+          <w:szCs w:val="36"/>
+        </w:rPr>
+        <w:br/>
+        <w:t>console.log(id);</w:t>
+      </w:r>
+    </w:p>
+    <w:p>
+      <w:pPr>
+        <w:ind w:right="-450"/>
+        <w:rPr>
+          <w:rFonts w:asciiTheme="majorBidi" w:hAnsiTheme="majorBidi" w:cstheme="majorBidi"/>
+          <w:b/>
+          <w:bCs/>
+          <w:sz w:val="36"/>
+          <w:szCs w:val="36"/>
+        </w:rPr>
+      </w:pPr>
+      <w:r>
+        <w:rPr>
+          <w:rFonts w:asciiTheme="majorBidi" w:hAnsiTheme="majorBidi" w:cstheme="majorBidi"/>
+          <w:b/>
+          <w:bCs/>
+          <w:sz w:val="36"/>
+          <w:szCs w:val="36"/>
+        </w:rPr>
+        <w:lastRenderedPageBreak/>
+        <w:t>2</w:t>
+      </w:r>
+      <w:r>
+        <w:rPr>
+          <w:rFonts w:asciiTheme="majorBidi" w:hAnsiTheme="majorBidi" w:cstheme="majorBidi"/>
+          <w:b/>
+          <w:bCs/>
+          <w:sz w:val="36"/>
+          <w:szCs w:val="36"/>
+        </w:rPr>
+        <w:t>)</w:t>
+      </w:r>
+      <w:r>
+        <w:rPr>
+          <w:rFonts w:asciiTheme="majorBidi" w:hAnsiTheme="majorBidi" w:cstheme="majorBidi"/>
+          <w:b/>
+          <w:bCs/>
+          <w:sz w:val="36"/>
+          <w:szCs w:val="36"/>
+        </w:rPr>
+        <w:t>. Non-Primitive (Reference) Data Types</w:t>
+      </w:r>
+    </w:p>
+    <w:p>
+      <w:pPr>
+        <w:ind w:right="-450"/>
+        <w:rPr>
+          <w:rFonts w:asciiTheme="majorBidi" w:hAnsiTheme="majorBidi" w:cstheme="majorBidi"/>
+          <w:sz w:val="36"/>
+          <w:szCs w:val="36"/>
+        </w:rPr>
+      </w:pPr>
+      <w:r>
+        <w:rPr>
+          <w:rFonts w:asciiTheme="majorBidi" w:hAnsiTheme="majorBidi" w:cstheme="majorBidi"/>
+          <w:sz w:val="36"/>
+          <w:szCs w:val="36"/>
+        </w:rPr>
+        <w:t>Non-primitive data types are used to store collections of data or more complex entities.</w:t>
+      </w:r>
+    </w:p>
+    <w:p>
+      <w:pPr>
+        <w:ind w:right="-450"/>
+        <w:rPr>
+          <w:rFonts w:asciiTheme="majorBidi" w:hAnsiTheme="majorBidi" w:cstheme="majorBidi"/>
+          <w:sz w:val="36"/>
+          <w:szCs w:val="36"/>
+        </w:rPr>
+      </w:pPr>
+      <w:r>
+        <w:rPr>
+          <w:rFonts w:asciiTheme="majorBidi" w:hAnsiTheme="majorBidi" w:cstheme="majorBidi"/>
+          <w:sz w:val="36"/>
+          <w:szCs w:val="36"/>
+        </w:rPr>
+        <w:t>(a) Object</w:t>
+      </w:r>
+    </w:p>
+    <w:p>
+      <w:pPr>
+        <w:ind w:right="-450"/>
+        <w:rPr>
+          <w:rFonts w:asciiTheme="majorBidi" w:hAnsiTheme="majorBidi" w:cstheme="majorBidi"/>
+          <w:sz w:val="36"/>
+          <w:szCs w:val="36"/>
+        </w:rPr>
+      </w:pPr>
+      <w:r>
+        <w:rPr>
+          <w:rFonts w:asciiTheme="majorBidi" w:hAnsiTheme="majorBidi" w:cstheme="majorBidi"/>
+          <w:sz w:val="36"/>
+          <w:szCs w:val="36"/>
+        </w:rPr>
+        <w:t>An Object stores data in key-value pairs.</w:t>
+      </w:r>
+    </w:p>
+    <w:p>
+      <w:pPr>
+        <w:ind w:right="-450"/>
+        <w:rPr>
+          <w:rFonts w:asciiTheme="majorBidi" w:hAnsiTheme="majorBidi" w:cstheme="majorBidi"/>
+          <w:sz w:val="36"/>
+          <w:szCs w:val="36"/>
+        </w:rPr>
+      </w:pPr>
+      <w:r>
+        <w:rPr>
+          <w:rFonts w:asciiTheme="majorBidi" w:hAnsiTheme="majorBidi" w:cstheme="majorBidi"/>
+          <w:sz w:val="36"/>
+          <w:szCs w:val="36"/>
+        </w:rPr>
+        <w:t>Example:</w:t>
+      </w:r>
+    </w:p>
+    <w:p>
+      <w:pPr>
+        <w:ind w:right="-450"/>
+        <w:rPr>
+          <w:rFonts w:asciiTheme="majorBidi" w:hAnsiTheme="majorBidi" w:cstheme="majorBidi"/>
+          <w:sz w:val="36"/>
+          <w:szCs w:val="36"/>
+        </w:rPr>
+      </w:pPr>
+      <w:r>
+        <w:rPr>
+          <w:rFonts w:asciiTheme="majorBidi" w:hAnsiTheme="majorBidi" w:cstheme="majorBidi"/>
+          <w:sz w:val="36"/>
+          <w:szCs w:val="36"/>
+        </w:rPr>
+        <w:t>let student = {</w:t>
+      </w:r>
+      <w:r>
+        <w:rPr>
+          <w:rFonts w:asciiTheme="majorBidi" w:hAnsiTheme="majorBidi" w:cstheme="majorBidi"/>
+          <w:sz w:val="36"/>
+          <w:szCs w:val="36"/>
+        </w:rPr>
+        <w:br/>
+        <w:t xml:space="preserve">  name: "Shreyansh",</w:t>
+      </w:r>
+      <w:r>
+        <w:rPr>
+          <w:rFonts w:asciiTheme="majorBidi" w:hAnsiTheme="majorBidi" w:cstheme="majorBidi"/>
+          <w:sz w:val="36"/>
+          <w:szCs w:val="36"/>
+        </w:rPr>
+        <w:br/>
+        <w:t xml:space="preserve">  age: 23,</w:t>
+      </w:r>
+      <w:r>
+        <w:rPr>
+          <w:rFonts w:asciiTheme="majorBidi" w:hAnsiTheme="majorBidi" w:cstheme="majorBidi"/>
+          <w:sz w:val="36"/>
+          <w:szCs w:val="36"/>
+        </w:rPr>
+        <w:br/>
+        <w:t xml:space="preserve">  city: "Rajkot"</w:t>
+      </w:r>
+      <w:r>
+        <w:rPr>
+          <w:rFonts w:asciiTheme="majorBidi" w:hAnsiTheme="majorBidi" w:cstheme="majorBidi"/>
+          <w:sz w:val="36"/>
+          <w:szCs w:val="36"/>
+        </w:rPr>
+        <w:br/>
+        <w:t>};</w:t>
+      </w:r>
+      <w:r>
+        <w:rPr>
+          <w:rFonts w:asciiTheme="majorBidi" w:hAnsiTheme="majorBidi" w:cstheme="majorBidi"/>
+          <w:sz w:val="36"/>
+          <w:szCs w:val="36"/>
+        </w:rPr>
+        <w:br/>
+      </w:r>
+      <w:r>
+        <w:rPr>
+          <w:rFonts w:asciiTheme="majorBidi" w:hAnsiTheme="majorBidi" w:cstheme="majorBidi"/>
+          <w:sz w:val="36"/>
+          <w:szCs w:val="36"/>
+        </w:rPr>
+        <w:br/>
+        <w:t>console.log(student);</w:t>
+      </w:r>
+    </w:p>
+    <w:p>
+      <w:pPr>
+        <w:ind w:right="-450"/>
+        <w:rPr>
+          <w:rFonts w:asciiTheme="majorBidi" w:hAnsiTheme="majorBidi" w:cstheme="majorBidi"/>
+          <w:sz w:val="36"/>
+          <w:szCs w:val="36"/>
+        </w:rPr>
+      </w:pPr>
+    </w:p>
+    <w:p>
+      <w:pPr>
+        <w:ind w:right="-450"/>
+        <w:rPr>
+          <w:rFonts w:asciiTheme="majorBidi" w:hAnsiTheme="majorBidi" w:cstheme="majorBidi"/>
+          <w:sz w:val="36"/>
+          <w:szCs w:val="36"/>
+        </w:rPr>
+      </w:pPr>
+      <w:r>
+        <w:rPr>
+          <w:rFonts w:asciiTheme="majorBidi" w:hAnsiTheme="majorBidi" w:cstheme="majorBidi"/>
+          <w:sz w:val="36"/>
+          <w:szCs w:val="36"/>
+        </w:rPr>
+        <w:t>(b) Array</w:t>
+      </w:r>
+    </w:p>
+    <w:p>
+      <w:pPr>
+        <w:ind w:right="-450"/>
+        <w:rPr>
+          <w:rFonts w:asciiTheme="majorBidi" w:hAnsiTheme="majorBidi" w:cstheme="majorBidi"/>
+          <w:sz w:val="36"/>
+          <w:szCs w:val="36"/>
+        </w:rPr>
+      </w:pPr>
+      <w:r>
+        <w:rPr>
+          <w:rFonts w:asciiTheme="majorBidi" w:hAnsiTheme="majorBidi" w:cstheme="majorBidi"/>
+          <w:sz w:val="36"/>
+          <w:szCs w:val="36"/>
+        </w:rPr>
+        <w:t>An Array is used to store multiple values in a single variable.</w:t>
+      </w:r>
+    </w:p>
+    <w:p>
+      <w:pPr>
+        <w:ind w:right="-450"/>
+        <w:rPr>
+          <w:rFonts w:asciiTheme="majorBidi" w:hAnsiTheme="majorBidi" w:cstheme="majorBidi"/>
+          <w:sz w:val="36"/>
+          <w:szCs w:val="36"/>
+        </w:rPr>
+      </w:pPr>
+      <w:r>
+        <w:rPr>
+          <w:rFonts w:asciiTheme="majorBidi" w:hAnsiTheme="majorBidi" w:cstheme="majorBidi"/>
+          <w:sz w:val="36"/>
+          <w:szCs w:val="36"/>
+        </w:rPr>
+        <w:t>Example:</w:t>
+      </w:r>
+    </w:p>
+    <w:p>
+      <w:pPr>
+        <w:ind w:right="-450"/>
+        <w:rPr>
+          <w:rFonts w:asciiTheme="majorBidi" w:hAnsiTheme="majorBidi" w:cstheme="majorBidi"/>
+          <w:sz w:val="36"/>
+          <w:szCs w:val="36"/>
+        </w:rPr>
+      </w:pPr>
+      <w:r>
+        <w:rPr>
+          <w:rFonts w:asciiTheme="majorBidi" w:hAnsiTheme="majorBidi" w:cstheme="majorBidi"/>
+          <w:sz w:val="36"/>
+          <w:szCs w:val="36"/>
+        </w:rPr>
+        <w:t>let colors = ["red", "green", "blue"];</w:t>
+      </w:r>
+      <w:r>
+        <w:rPr>
+          <w:rFonts w:asciiTheme="majorBidi" w:hAnsiTheme="majorBidi" w:cstheme="majorBidi"/>
+          <w:sz w:val="36"/>
+          <w:szCs w:val="36"/>
+        </w:rPr>
+        <w:br/>
+      </w:r>
+      <w:r>
+        <w:rPr>
+          <w:rFonts w:asciiTheme="majorBidi" w:hAnsiTheme="majorBidi" w:cstheme="majorBidi"/>
+          <w:sz w:val="36"/>
+          <w:szCs w:val="36"/>
+        </w:rPr>
+        <w:br/>
+        <w:t>console.log(colors);</w:t>
+      </w:r>
+    </w:p>
+    <w:p>
+      <w:pPr>
+        <w:ind w:right="-450"/>
+        <w:rPr>
+          <w:rFonts w:asciiTheme="majorBidi" w:hAnsiTheme="majorBidi" w:cstheme="majorBidi"/>
+          <w:sz w:val="36"/>
+          <w:szCs w:val="36"/>
+        </w:rPr>
+      </w:pPr>
+    </w:p>
+    <w:p>
+      <w:pPr>
+        <w:ind w:right="-450"/>
+        <w:rPr>
+          <w:rFonts w:asciiTheme="majorBidi" w:hAnsiTheme="majorBidi" w:cstheme="majorBidi"/>
+          <w:sz w:val="36"/>
+          <w:szCs w:val="36"/>
+        </w:rPr>
+      </w:pPr>
+      <w:r>
+        <w:rPr>
+          <w:rFonts w:asciiTheme="majorBidi" w:hAnsiTheme="majorBidi" w:cstheme="majorBidi"/>
+          <w:sz w:val="36"/>
+          <w:szCs w:val="36"/>
+        </w:rPr>
+        <w:t>(c) Function</w:t>
+      </w:r>
+    </w:p>
+    <w:p>
+      <w:pPr>
+        <w:ind w:right="-450"/>
+        <w:rPr>
+          <w:rFonts w:asciiTheme="majorBidi" w:hAnsiTheme="majorBidi" w:cstheme="majorBidi"/>
+          <w:sz w:val="36"/>
+          <w:szCs w:val="36"/>
+        </w:rPr>
+      </w:pPr>
+      <w:r>
+        <w:rPr>
+          <w:rFonts w:asciiTheme="majorBidi" w:hAnsiTheme="majorBidi" w:cstheme="majorBidi"/>
+          <w:sz w:val="36"/>
+          <w:szCs w:val="36"/>
+        </w:rPr>
+        <w:t>A Function is a block of reusable code.</w:t>
+      </w:r>
+    </w:p>
+    <w:p>
+      <w:pPr>
+        <w:ind w:right="-450"/>
+        <w:rPr>
+          <w:rFonts w:asciiTheme="majorBidi" w:hAnsiTheme="majorBidi" w:cstheme="majorBidi"/>
+          <w:sz w:val="36"/>
+          <w:szCs w:val="36"/>
+        </w:rPr>
+      </w:pPr>
+      <w:r>
+        <w:rPr>
+          <w:rFonts w:asciiTheme="majorBidi" w:hAnsiTheme="majorBidi" w:cstheme="majorBidi"/>
+          <w:sz w:val="36"/>
+          <w:szCs w:val="36"/>
+        </w:rPr>
+        <w:lastRenderedPageBreak/>
+        <w:t>Example:</w:t>
+      </w:r>
+    </w:p>
+    <w:p>
+      <w:pPr>
+        <w:ind w:right="-450"/>
+        <w:rPr>
+          <w:rFonts w:asciiTheme="majorBidi" w:hAnsiTheme="majorBidi" w:cstheme="majorBidi"/>
+          <w:sz w:val="36"/>
+          <w:szCs w:val="36"/>
+        </w:rPr>
+      </w:pPr>
+      <w:r>
+        <w:rPr>
+          <w:rFonts w:asciiTheme="majorBidi" w:hAnsiTheme="majorBidi" w:cstheme="majorBidi"/>
+          <w:sz w:val="36"/>
+          <w:szCs w:val="36"/>
+        </w:rPr>
+        <w:t>function greet() {</w:t>
+      </w:r>
+      <w:r>
+        <w:rPr>
+          <w:rFonts w:asciiTheme="majorBidi" w:hAnsiTheme="majorBidi" w:cstheme="majorBidi"/>
+          <w:sz w:val="36"/>
+          <w:szCs w:val="36"/>
+        </w:rPr>
+        <w:br/>
+        <w:t xml:space="preserve">  console.log("Hello World");</w:t>
+      </w:r>
+      <w:r>
+        <w:rPr>
+          <w:rFonts w:asciiTheme="majorBidi" w:hAnsiTheme="majorBidi" w:cstheme="majorBidi"/>
+          <w:sz w:val="36"/>
+          <w:szCs w:val="36"/>
+        </w:rPr>
+        <w:br/>
+        <w:t>}</w:t>
+      </w:r>
+      <w:r>
+        <w:rPr>
+          <w:rFonts w:asciiTheme="majorBidi" w:hAnsiTheme="majorBidi" w:cstheme="majorBidi"/>
+          <w:sz w:val="36"/>
+          <w:szCs w:val="36"/>
+        </w:rPr>
+        <w:br/>
+      </w:r>
+      <w:r>
+        <w:rPr>
+          <w:rFonts w:asciiTheme="majorBidi" w:hAnsiTheme="majorBidi" w:cstheme="majorBidi"/>
+          <w:sz w:val="36"/>
+          <w:szCs w:val="36"/>
+        </w:rPr>
+        <w:br/>
+        <w:t>greet();</w:t>
+      </w:r>
+    </w:p>
+    <w:p>
+      <w:pPr>
+        <w:ind w:right="-450"/>
+        <w:rPr>
+          <w:rFonts w:asciiTheme="majorBidi" w:hAnsiTheme="majorBidi" w:cstheme="majorBidi"/>
+          <w:sz w:val="36"/>
+          <w:szCs w:val="36"/>
+        </w:rPr>
+      </w:pPr>
+    </w:p>
+    <w:p>
+      <w:pPr>
+        <w:ind w:right="-450"/>
+        <w:rPr>
+          <w:rFonts w:asciiTheme="majorBidi" w:hAnsiTheme="majorBidi" w:cstheme="majorBidi"/>
+          <w:sz w:val="36"/>
+          <w:szCs w:val="36"/>
+        </w:rPr>
+      </w:pPr>
+      <w:proofErr w:type="spellStart"/>
+      <w:r>
+        <w:rPr>
+          <w:rFonts w:asciiTheme="majorBidi" w:hAnsiTheme="majorBidi" w:cstheme="majorBidi"/>
+          <w:sz w:val="36"/>
+          <w:szCs w:val="36"/>
+        </w:rPr>
+        <w:t>typeof</w:t>
+      </w:r>
+      <w:proofErr w:type="spellEnd"/>
+      <w:r>
+        <w:rPr>
+          <w:rFonts w:asciiTheme="majorBidi" w:hAnsiTheme="majorBidi" w:cstheme="majorBidi"/>
+          <w:sz w:val="36"/>
+          <w:szCs w:val="36"/>
+        </w:rPr>
+        <w:t xml:space="preserve"> Operator</w:t>
+      </w:r>
+    </w:p>
+    <w:p>
+      <w:pPr>
+        <w:ind w:right="-450"/>
+        <w:rPr>
+          <w:rFonts w:asciiTheme="majorBidi" w:hAnsiTheme="majorBidi" w:cstheme="majorBidi"/>
+          <w:sz w:val="36"/>
+          <w:szCs w:val="36"/>
+        </w:rPr>
+      </w:pPr>
+      <w:r>
+        <w:rPr>
+          <w:rFonts w:asciiTheme="majorBidi" w:hAnsiTheme="majorBidi" w:cstheme="majorBidi"/>
+          <w:sz w:val="36"/>
+          <w:szCs w:val="36"/>
+        </w:rPr>
+        <w:t xml:space="preserve">The </w:t>
+      </w:r>
+      <w:proofErr w:type="spellStart"/>
+      <w:r>
+        <w:rPr>
+          <w:rFonts w:asciiTheme="majorBidi" w:hAnsiTheme="majorBidi" w:cstheme="majorBidi"/>
+          <w:sz w:val="36"/>
+          <w:szCs w:val="36"/>
+        </w:rPr>
+        <w:t>typeof</w:t>
+      </w:r>
+      <w:proofErr w:type="spellEnd"/>
+      <w:r>
+        <w:rPr>
+          <w:rFonts w:asciiTheme="majorBidi" w:hAnsiTheme="majorBidi" w:cstheme="majorBidi"/>
+          <w:sz w:val="36"/>
+          <w:szCs w:val="36"/>
+        </w:rPr>
+        <w:t xml:space="preserve"> operator is used to check the data type of a variable.</w:t>
+      </w:r>
+    </w:p>
+    <w:p>
+      <w:pPr>
+        <w:ind w:right="-450"/>
+        <w:rPr>
+          <w:rFonts w:asciiTheme="majorBidi" w:hAnsiTheme="majorBidi" w:cstheme="majorBidi"/>
+          <w:sz w:val="36"/>
+          <w:szCs w:val="36"/>
+        </w:rPr>
+      </w:pPr>
+      <w:r>
+        <w:rPr>
+          <w:rFonts w:asciiTheme="majorBidi" w:hAnsiTheme="majorBidi" w:cstheme="majorBidi"/>
+          <w:sz w:val="36"/>
+          <w:szCs w:val="36"/>
+        </w:rPr>
+        <w:t>Example:</w:t>
+      </w:r>
+    </w:p>
+    <w:p>
+      <w:pPr>
+        <w:ind w:right="-450"/>
+        <w:rPr>
+          <w:rFonts w:asciiTheme="majorBidi" w:hAnsiTheme="majorBidi" w:cstheme="majorBidi"/>
+          <w:sz w:val="36"/>
+          <w:szCs w:val="36"/>
+        </w:rPr>
+      </w:pPr>
+      <w:r>
+        <w:rPr>
+          <w:rFonts w:asciiTheme="majorBidi" w:hAnsiTheme="majorBidi" w:cstheme="majorBidi"/>
+          <w:sz w:val="36"/>
+          <w:szCs w:val="36"/>
+        </w:rPr>
+        <w:t>let a = 10;</w:t>
+      </w:r>
+      <w:r>
+        <w:rPr>
+          <w:rFonts w:asciiTheme="majorBidi" w:hAnsiTheme="majorBidi" w:cstheme="majorBidi"/>
+          <w:sz w:val="36"/>
+          <w:szCs w:val="36"/>
+        </w:rPr>
+        <w:br/>
+      </w:r>
+      <w:r>
+        <w:rPr>
+          <w:rFonts w:asciiTheme="majorBidi" w:hAnsiTheme="majorBidi" w:cstheme="majorBidi"/>
+          <w:sz w:val="36"/>
+          <w:szCs w:val="36"/>
+        </w:rPr>
+        <w:br/>
+        <w:t>console.log(</w:t>
+      </w:r>
+      <w:proofErr w:type="spellStart"/>
+      <w:r>
+        <w:rPr>
+          <w:rFonts w:asciiTheme="majorBidi" w:hAnsiTheme="majorBidi" w:cstheme="majorBidi"/>
+          <w:sz w:val="36"/>
+          <w:szCs w:val="36"/>
+        </w:rPr>
+        <w:t>typeof</w:t>
+      </w:r>
+      <w:proofErr w:type="spellEnd"/>
+      <w:r>
+        <w:rPr>
+          <w:rFonts w:asciiTheme="majorBidi" w:hAnsiTheme="majorBidi" w:cstheme="majorBidi"/>
+          <w:sz w:val="36"/>
+          <w:szCs w:val="36"/>
+        </w:rPr>
+        <w:t xml:space="preserve"> a);</w:t>
+      </w:r>
+    </w:p>
+    <w:p>
+      <w:pPr>
+        <w:ind w:right="-450"/>
+        <w:rPr>
+          <w:rFonts w:asciiTheme="majorBidi" w:hAnsiTheme="majorBidi" w:cstheme="majorBidi"/>
+          <w:sz w:val="36"/>
+          <w:szCs w:val="36"/>
+        </w:rPr>
+      </w:pPr>
+      <w:r>
+        <w:rPr>
+          <w:rFonts w:asciiTheme="majorBidi" w:hAnsiTheme="majorBidi" w:cstheme="majorBidi"/>
+          <w:sz w:val="36"/>
+          <w:szCs w:val="36"/>
+        </w:rPr>
+        <w:t>Output:</w:t>
+      </w:r>
+    </w:p>
+    <w:p>
+      <w:pPr>
+        <w:ind w:right="-450"/>
+        <w:rPr>
+          <w:rFonts w:asciiTheme="majorBidi" w:hAnsiTheme="majorBidi" w:cstheme="majorBidi"/>
+          <w:sz w:val="36"/>
+          <w:szCs w:val="36"/>
+        </w:rPr>
+      </w:pPr>
+      <w:r>
+        <w:rPr>
+          <w:rFonts w:asciiTheme="majorBidi" w:hAnsiTheme="majorBidi" w:cstheme="majorBidi"/>
+          <w:sz w:val="36"/>
+          <w:szCs w:val="36"/>
+        </w:rPr>
+        <w:t>N</w:t>
+      </w:r>
+      <w:r>
+        <w:rPr>
+          <w:rFonts w:asciiTheme="majorBidi" w:hAnsiTheme="majorBidi" w:cstheme="majorBidi"/>
+          <w:sz w:val="36"/>
+          <w:szCs w:val="36"/>
+        </w:rPr>
+        <w:t>umber</w:t>
+      </w:r>
+    </w:p>
+    <w:p>
+      <w:pPr>
+        <w:ind w:right="-450"/>
+        <w:rPr>
+          <w:rFonts w:asciiTheme="majorBidi" w:hAnsiTheme="majorBidi" w:cstheme="majorBidi"/>
+          <w:sz w:val="36"/>
+          <w:szCs w:val="36"/>
+        </w:rPr>
+      </w:pPr>
+    </w:p>
+    <w:p>
+      <w:pPr>
+        <w:ind w:right="-450"/>
+        <w:rPr>
+          <w:rFonts w:asciiTheme="majorBidi" w:hAnsiTheme="majorBidi" w:cstheme="majorBidi"/>
+          <w:sz w:val="36"/>
+          <w:szCs w:val="36"/>
+        </w:rPr>
+      </w:pPr>
+    </w:p>
+    <w:p>
+      <w:pPr>
+        <w:ind w:right="-450"/>
+        <w:rPr>
+          <w:rFonts w:asciiTheme="majorBidi" w:hAnsiTheme="majorBidi" w:cstheme="majorBidi"/>
+          <w:sz w:val="36"/>
+          <w:szCs w:val="36"/>
+        </w:rPr>
+      </w:pPr>
+    </w:p>
+    <w:p>
+      <w:pPr>
+        <w:ind w:right="-450"/>
+        <w:rPr>
+          <w:rFonts w:asciiTheme="majorBidi" w:hAnsiTheme="majorBidi" w:cstheme="majorBidi"/>
+          <w:sz w:val="36"/>
+          <w:szCs w:val="36"/>
+        </w:rPr>
+      </w:pPr>
+    </w:p>
+    <w:p>
+      <w:pPr>
+        <w:ind w:right="-450"/>
+        <w:rPr>
+          <w:rFonts w:asciiTheme="majorBidi" w:hAnsiTheme="majorBidi" w:cstheme="majorBidi"/>
+          <w:sz w:val="36"/>
+          <w:szCs w:val="36"/>
+        </w:rPr>
+      </w:pPr>
+    </w:p>
+    <w:p>
+      <w:pPr>
+        <w:ind w:right="-450"/>
+        <w:rPr>
+          <w:rFonts w:asciiTheme="majorBidi" w:hAnsiTheme="majorBidi" w:cstheme="majorBidi"/>
+          <w:sz w:val="36"/>
+          <w:szCs w:val="36"/>
+        </w:rPr>
+      </w:pPr>
+    </w:p>
+    <w:p>
+      <w:pPr>
+        <w:ind w:right="-450"/>
+        <w:rPr>
+          <w:rFonts w:asciiTheme="majorBidi" w:hAnsiTheme="majorBidi" w:cstheme="majorBidi"/>
+          <w:sz w:val="36"/>
+          <w:szCs w:val="36"/>
+        </w:rPr>
+      </w:pPr>
+    </w:p>
+    <w:p>
+      <w:pPr>
+        <w:ind w:right="-450"/>
+        <w:rPr>
+          <w:rFonts w:asciiTheme="majorBidi" w:hAnsiTheme="majorBidi" w:cstheme="majorBidi"/>
+          <w:b/>
+          <w:bCs/>
+          <w:sz w:val="36"/>
+          <w:szCs w:val="36"/>
+        </w:rPr>
+      </w:pPr>
+      <w:r>
+        <w:rPr>
+          <w:rFonts w:asciiTheme="majorBidi" w:hAnsiTheme="majorBidi" w:cstheme="majorBidi"/>
+          <w:b/>
+          <w:bCs/>
+          <w:sz w:val="36"/>
+          <w:szCs w:val="36"/>
+        </w:rPr>
+        <w:lastRenderedPageBreak/>
+        <w:t>Question 3: What is the difference between undefined and null in JavaScript?</w:t>
+      </w:r>
+    </w:p>
+    <w:p>
+      <w:pPr>
+        <w:ind w:right="-450"/>
+        <w:rPr>
+          <w:rFonts w:asciiTheme="majorBidi" w:hAnsiTheme="majorBidi" w:cstheme="majorBidi"/>
+          <w:sz w:val="36"/>
+          <w:szCs w:val="36"/>
+        </w:rPr>
+      </w:pPr>
+      <w:r>
+        <w:rPr>
+          <w:rFonts w:asciiTheme="majorBidi" w:hAnsiTheme="majorBidi" w:cstheme="majorBidi"/>
+          <w:sz w:val="36"/>
+          <w:szCs w:val="36"/>
+        </w:rPr>
+        <w:t>Ans:</w:t>
+      </w:r>
+    </w:p>
+    <w:p>
+      <w:pPr>
+        <w:ind w:right="-450"/>
+        <w:rPr>
+          <w:rFonts w:asciiTheme="majorBidi" w:hAnsiTheme="majorBidi" w:cstheme="majorBidi"/>
+          <w:sz w:val="36"/>
+          <w:szCs w:val="36"/>
+        </w:rPr>
+      </w:pPr>
+      <w:r>
+        <w:rPr>
+          <w:rFonts w:asciiTheme="majorBidi" w:hAnsiTheme="majorBidi" w:cstheme="majorBidi"/>
+          <w:sz w:val="36"/>
+          <w:szCs w:val="36"/>
+        </w:rPr>
+        <w:t>In JavaScript, both undefined and null represent empty values, but they are different from each other.</w:t>
+      </w:r>
+    </w:p>
+    <w:p>
+      <w:pPr>
+        <w:ind w:right="-450"/>
+        <w:rPr>
+          <w:rFonts w:asciiTheme="majorBidi" w:hAnsiTheme="majorBidi" w:cstheme="majorBidi"/>
+          <w:b/>
+          <w:bCs/>
+          <w:sz w:val="36"/>
+          <w:szCs w:val="36"/>
+        </w:rPr>
+      </w:pPr>
+      <w:r>
+        <w:rPr>
+          <w:rFonts w:asciiTheme="majorBidi" w:hAnsiTheme="majorBidi" w:cstheme="majorBidi"/>
+          <w:b/>
+          <w:bCs/>
+          <w:sz w:val="36"/>
+          <w:szCs w:val="36"/>
+        </w:rPr>
+        <w:t>Undefined</w:t>
+      </w:r>
+    </w:p>
+    <w:p>
+      <w:pPr>
+        <w:ind w:right="-450"/>
+        <w:rPr>
+          <w:rFonts w:asciiTheme="majorBidi" w:hAnsiTheme="majorBidi" w:cstheme="majorBidi"/>
+          <w:sz w:val="36"/>
+          <w:szCs w:val="36"/>
+        </w:rPr>
+      </w:pPr>
+      <w:r>
+        <w:rPr>
+          <w:rFonts w:asciiTheme="majorBidi" w:hAnsiTheme="majorBidi" w:cstheme="majorBidi"/>
+          <w:sz w:val="36"/>
+          <w:szCs w:val="36"/>
+        </w:rPr>
+        <w:t>undefined means a variable has been declared but no value has been assigned to it.</w:t>
+      </w:r>
+    </w:p>
+    <w:p>
+      <w:pPr>
+        <w:ind w:right="-450"/>
+        <w:rPr>
+          <w:rFonts w:asciiTheme="majorBidi" w:hAnsiTheme="majorBidi" w:cstheme="majorBidi"/>
+          <w:sz w:val="36"/>
+          <w:szCs w:val="36"/>
+        </w:rPr>
+      </w:pPr>
+      <w:r>
+        <w:rPr>
+          <w:rFonts w:asciiTheme="majorBidi" w:hAnsiTheme="majorBidi" w:cstheme="majorBidi"/>
+          <w:sz w:val="36"/>
+          <w:szCs w:val="36"/>
+        </w:rPr>
+        <w:t>Example:</w:t>
+      </w:r>
+    </w:p>
+    <w:p>
+      <w:pPr>
+        <w:ind w:right="-450"/>
+        <w:rPr>
+          <w:rFonts w:asciiTheme="majorBidi" w:hAnsiTheme="majorBidi" w:cstheme="majorBidi"/>
+          <w:sz w:val="36"/>
+          <w:szCs w:val="36"/>
+        </w:rPr>
+      </w:pPr>
+      <w:r>
+        <w:rPr>
+          <w:rFonts w:asciiTheme="majorBidi" w:hAnsiTheme="majorBidi" w:cstheme="majorBidi"/>
+          <w:sz w:val="36"/>
+          <w:szCs w:val="36"/>
+        </w:rPr>
+        <w:t>let x;</w:t>
+      </w:r>
+      <w:r>
+        <w:rPr>
+          <w:rFonts w:asciiTheme="majorBidi" w:hAnsiTheme="majorBidi" w:cstheme="majorBidi"/>
+          <w:sz w:val="36"/>
+          <w:szCs w:val="36"/>
+        </w:rPr>
+        <w:br/>
+        <w:t>console.log(x);</w:t>
+      </w:r>
+    </w:p>
+    <w:p>
+      <w:pPr>
+        <w:ind w:right="-450"/>
+        <w:rPr>
+          <w:rFonts w:asciiTheme="majorBidi" w:hAnsiTheme="majorBidi" w:cstheme="majorBidi"/>
+          <w:sz w:val="36"/>
+          <w:szCs w:val="36"/>
+        </w:rPr>
+      </w:pPr>
+      <w:r>
+        <w:rPr>
+          <w:rFonts w:asciiTheme="majorBidi" w:hAnsiTheme="majorBidi" w:cstheme="majorBidi"/>
+          <w:sz w:val="36"/>
+          <w:szCs w:val="36"/>
+        </w:rPr>
+        <w:t>Output:</w:t>
+      </w:r>
+    </w:p>
+    <w:p>
+      <w:pPr>
+        <w:ind w:right="-450"/>
+        <w:rPr>
+          <w:rFonts w:asciiTheme="majorBidi" w:hAnsiTheme="majorBidi" w:cstheme="majorBidi"/>
+          <w:sz w:val="36"/>
+          <w:szCs w:val="36"/>
+        </w:rPr>
+      </w:pPr>
+      <w:r>
+        <w:rPr>
+          <w:rFonts w:asciiTheme="majorBidi" w:hAnsiTheme="majorBidi" w:cstheme="majorBidi"/>
+          <w:sz w:val="36"/>
+          <w:szCs w:val="36"/>
+        </w:rPr>
+        <w:t>undefined</w:t>
+      </w:r>
+    </w:p>
+    <w:p>
+      <w:pPr>
+        <w:ind w:right="-450"/>
+        <w:rPr>
+          <w:rFonts w:asciiTheme="majorBidi" w:hAnsiTheme="majorBidi" w:cstheme="majorBidi"/>
+          <w:sz w:val="36"/>
+          <w:szCs w:val="36"/>
+        </w:rPr>
+      </w:pPr>
+      <w:r>
+        <w:rPr>
+          <w:rFonts w:asciiTheme="majorBidi" w:hAnsiTheme="majorBidi" w:cstheme="majorBidi"/>
+          <w:sz w:val="36"/>
+          <w:szCs w:val="36"/>
+        </w:rPr>
+        <w:t>Explanation:</w:t>
+      </w:r>
+      <w:r>
+        <w:rPr>
+          <w:rFonts w:asciiTheme="majorBidi" w:hAnsiTheme="majorBidi" w:cstheme="majorBidi"/>
+          <w:sz w:val="36"/>
+          <w:szCs w:val="36"/>
+        </w:rPr>
+        <w:br/>
+        <w:t>In the above example, the variable x is created but no value is given, so JavaScript automatically assigns undefined.</w:t>
+      </w:r>
+    </w:p>
+    <w:p>
+      <w:pPr>
+        <w:ind w:right="-450"/>
+        <w:rPr>
+          <w:rFonts w:asciiTheme="majorBidi" w:hAnsiTheme="majorBidi" w:cstheme="majorBidi"/>
+          <w:sz w:val="36"/>
+          <w:szCs w:val="36"/>
+        </w:rPr>
+      </w:pPr>
+    </w:p>
+    <w:p>
+      <w:pPr>
+        <w:ind w:right="-450"/>
+        <w:rPr>
+          <w:rFonts w:asciiTheme="majorBidi" w:hAnsiTheme="majorBidi" w:cstheme="majorBidi"/>
+          <w:b/>
+          <w:bCs/>
+          <w:sz w:val="36"/>
+          <w:szCs w:val="36"/>
+        </w:rPr>
+      </w:pPr>
+      <w:r>
+        <w:rPr>
+          <w:rFonts w:asciiTheme="majorBidi" w:hAnsiTheme="majorBidi" w:cstheme="majorBidi"/>
+          <w:b/>
+          <w:bCs/>
+          <w:sz w:val="36"/>
+          <w:szCs w:val="36"/>
+        </w:rPr>
+        <w:t>Null</w:t>
+      </w:r>
+    </w:p>
+    <w:p>
+      <w:pPr>
+        <w:ind w:right="-450"/>
+        <w:rPr>
+          <w:rFonts w:asciiTheme="majorBidi" w:hAnsiTheme="majorBidi" w:cstheme="majorBidi"/>
+          <w:sz w:val="36"/>
+          <w:szCs w:val="36"/>
+        </w:rPr>
+      </w:pPr>
+      <w:r>
+        <w:rPr>
+          <w:rFonts w:asciiTheme="majorBidi" w:hAnsiTheme="majorBidi" w:cstheme="majorBidi"/>
+          <w:sz w:val="36"/>
+          <w:szCs w:val="36"/>
+        </w:rPr>
+        <w:t>null is an intentional empty value assigned by the programmer.</w:t>
+      </w:r>
+    </w:p>
+    <w:p>
+      <w:pPr>
+        <w:ind w:right="-450"/>
+        <w:rPr>
+          <w:rFonts w:asciiTheme="majorBidi" w:hAnsiTheme="majorBidi" w:cstheme="majorBidi"/>
+          <w:sz w:val="36"/>
+          <w:szCs w:val="36"/>
+        </w:rPr>
+      </w:pPr>
+      <w:r>
+        <w:rPr>
+          <w:rFonts w:asciiTheme="majorBidi" w:hAnsiTheme="majorBidi" w:cstheme="majorBidi"/>
+          <w:sz w:val="36"/>
+          <w:szCs w:val="36"/>
+        </w:rPr>
+        <w:t>Example:</w:t>
+      </w:r>
+    </w:p>
+    <w:p>
+      <w:pPr>
+        <w:ind w:right="-450"/>
+        <w:rPr>
+          <w:rFonts w:asciiTheme="majorBidi" w:hAnsiTheme="majorBidi" w:cstheme="majorBidi"/>
+          <w:sz w:val="36"/>
+          <w:szCs w:val="36"/>
+        </w:rPr>
+      </w:pPr>
+      <w:r>
+        <w:rPr>
+          <w:rFonts w:asciiTheme="majorBidi" w:hAnsiTheme="majorBidi" w:cstheme="majorBidi"/>
+          <w:sz w:val="36"/>
+          <w:szCs w:val="36"/>
+        </w:rPr>
+        <w:t>let data = null;</w:t>
+      </w:r>
+      <w:r>
+        <w:rPr>
+          <w:rFonts w:asciiTheme="majorBidi" w:hAnsiTheme="majorBidi" w:cstheme="majorBidi"/>
+          <w:sz w:val="36"/>
+          <w:szCs w:val="36"/>
+        </w:rPr>
+        <w:br/>
+        <w:t>console.log(data);</w:t>
+      </w:r>
+    </w:p>
+    <w:p>
+      <w:pPr>
+        <w:ind w:right="-450"/>
+        <w:rPr>
+          <w:rFonts w:asciiTheme="majorBidi" w:hAnsiTheme="majorBidi" w:cstheme="majorBidi"/>
+          <w:sz w:val="36"/>
+          <w:szCs w:val="36"/>
+        </w:rPr>
+      </w:pPr>
+      <w:r>
+        <w:rPr>
+          <w:rFonts w:asciiTheme="majorBidi" w:hAnsiTheme="majorBidi" w:cstheme="majorBidi"/>
+          <w:sz w:val="36"/>
+          <w:szCs w:val="36"/>
+        </w:rPr>
+        <w:t>Output:</w:t>
+      </w:r>
+      <w:r>
+        <w:rPr>
+          <w:rFonts w:asciiTheme="majorBidi" w:hAnsiTheme="majorBidi" w:cstheme="majorBidi"/>
+          <w:sz w:val="36"/>
+          <w:szCs w:val="36"/>
+        </w:rPr>
+        <w:t xml:space="preserve"> </w:t>
+      </w:r>
+      <w:r>
+        <w:rPr>
+          <w:rFonts w:asciiTheme="majorBidi" w:hAnsiTheme="majorBidi" w:cstheme="majorBidi"/>
+          <w:sz w:val="36"/>
+          <w:szCs w:val="36"/>
+        </w:rPr>
+        <w:t>null</w:t>
+      </w:r>
+    </w:p>
+    <w:p>
+      <w:pPr>
+        <w:ind w:right="-450"/>
+        <w:rPr>
+          <w:rFonts w:asciiTheme="majorBidi" w:hAnsiTheme="majorBidi" w:cstheme="majorBidi"/>
+          <w:sz w:val="36"/>
+          <w:szCs w:val="36"/>
+        </w:rPr>
+      </w:pPr>
+    </w:p>
+    <w:p>
+      <w:pPr>
+        <w:ind w:right="-450"/>
+        <w:rPr>
+          <w:rFonts w:asciiTheme="majorBidi" w:hAnsiTheme="majorBidi" w:cstheme="majorBidi"/>
+          <w:sz w:val="36"/>
+          <w:szCs w:val="36"/>
+        </w:rPr>
+      </w:pPr>
+    </w:p>
+    <w:p>
+      <w:pPr>
+        <w:ind w:right="-450"/>
+        <w:rPr>
+          <w:rFonts w:asciiTheme="majorBidi" w:hAnsiTheme="majorBidi" w:cstheme="majorBidi"/>
+          <w:b/>
+          <w:bCs/>
           <w:sz w:val="36"/>
           <w:szCs w:val="36"/>
         </w:rPr>
@@ -3672,6 +5688,119 @@
     </w:lvl>
   </w:abstractNum>
   <w:abstractNum w:abstractNumId="14" w15:restartNumberingAfterBreak="0">
+    <w:nsid w:val="0E452550"/>
+    <w:multiLevelType w:val="multilevel"/>
+    <w:tmpl w:val="4D029E76"/>
+    <w:lvl w:ilvl="0">
+      <w:start w:val="1"/>
+      <w:numFmt w:val="decimal"/>
+      <w:lvlText w:val="%1."/>
+      <w:lvlJc w:val="left"/>
+      <w:pPr>
+        <w:tabs>
+          <w:tab w:val="num" w:pos="720"/>
+        </w:tabs>
+        <w:ind w:left="720" w:hanging="360"/>
+      </w:pPr>
+    </w:lvl>
+    <w:lvl w:ilvl="1" w:tentative="1">
+      <w:start w:val="1"/>
+      <w:numFmt w:val="decimal"/>
+      <w:lvlText w:val="%2."/>
+      <w:lvlJc w:val="left"/>
+      <w:pPr>
+        <w:tabs>
+          <w:tab w:val="num" w:pos="1440"/>
+        </w:tabs>
+        <w:ind w:left="1440" w:hanging="360"/>
+      </w:pPr>
+    </w:lvl>
+    <w:lvl w:ilvl="2" w:tentative="1">
+      <w:start w:val="1"/>
+      <w:numFmt w:val="decimal"/>
+      <w:lvlText w:val="%3."/>
+      <w:lvlJc w:val="left"/>
+      <w:pPr>
+        <w:tabs>
+          <w:tab w:val="num" w:pos="2160"/>
+        </w:tabs>
+        <w:ind w:left="2160" w:hanging="360"/>
+      </w:pPr>
+    </w:lvl>
+    <w:lvl w:ilvl="3" w:tentative="1">
+      <w:start w:val="1"/>
+      <w:numFmt w:val="decimal"/>
+      <w:lvlText w:val="%4."/>
+      <w:lvlJc w:val="left"/>
+      <w:pPr>
+        <w:tabs>
+          <w:tab w:val="num" w:pos="2880"/>
+        </w:tabs>
+        <w:ind w:left="2880" w:hanging="360"/>
+      </w:pPr>
+    </w:lvl>
+    <w:lvl w:ilvl="4" w:tentative="1">
+      <w:start w:val="1"/>
+      <w:numFmt w:val="decimal"/>
+      <w:lvlText w:val="%5."/>
+      <w:lvlJc w:val="left"/>
+      <w:pPr>
+        <w:tabs>
+          <w:tab w:val="num" w:pos="3600"/>
+        </w:tabs>
+        <w:ind w:left="3600" w:hanging="360"/>
+      </w:pPr>
+    </w:lvl>
+    <w:lvl w:ilvl="5" w:tentative="1">
+      <w:start w:val="1"/>
+      <w:numFmt w:val="decimal"/>
+      <w:lvlText w:val="%6."/>
+      <w:lvlJc w:val="left"/>
+      <w:pPr>
+        <w:tabs>
+          <w:tab w:val="num" w:pos="4320"/>
+        </w:tabs>
+        <w:ind w:left="4320" w:hanging="360"/>
+      </w:pPr>
+    </w:lvl>
+    <w:lvl w:ilvl="6" w:tentative="1">
+      <w:start w:val="1"/>
+      <w:numFmt w:val="decimal"/>
+      <w:lvlText w:val="%7."/>
+      <w:lvlJc w:val="left"/>
+      <w:pPr>
+        <w:tabs>
+          <w:tab w:val="num" w:pos="5040"/>
+        </w:tabs>
+        <w:ind w:left="5040" w:hanging="360"/>
+      </w:pPr>
+    </w:lvl>
+    <w:lvl w:ilvl="7" w:tentative="1">
+      <w:start w:val="1"/>
+      <w:numFmt w:val="decimal"/>
+      <w:lvlText w:val="%8."/>
+      <w:lvlJc w:val="left"/>
+      <w:pPr>
+        <w:tabs>
+          <w:tab w:val="num" w:pos="5760"/>
+        </w:tabs>
+        <w:ind w:left="5760" w:hanging="360"/>
+      </w:pPr>
+    </w:lvl>
+    <w:lvl w:ilvl="8" w:tentative="1">
+      <w:start w:val="1"/>
+      <w:numFmt w:val="decimal"/>
+      <w:lvlText w:val="%9."/>
+      <w:lvlJc w:val="left"/>
+      <w:pPr>
+        <w:tabs>
+          <w:tab w:val="num" w:pos="6480"/>
+        </w:tabs>
+        <w:ind w:left="6480" w:hanging="360"/>
+      </w:pPr>
+    </w:lvl>
+  </w:abstractNum>
+  <w:abstractNum w:abstractNumId="15" w15:restartNumberingAfterBreak="0">
     <w:nsid w:val="0EFF7DF6"/>
     <w:multiLevelType w:val="hybridMultilevel"/>
     <w:tmpl w:val="39E21A7C"/>
@@ -3784,7 +5913,7 @@
       </w:rPr>
     </w:lvl>
   </w:abstractNum>
-  <w:abstractNum w:abstractNumId="15" w15:restartNumberingAfterBreak="0">
+  <w:abstractNum w:abstractNumId="16" w15:restartNumberingAfterBreak="0">
     <w:nsid w:val="182A2B6E"/>
     <w:multiLevelType w:val="hybridMultilevel"/>
     <w:tmpl w:val="A14ED070"/>
@@ -3897,7 +6026,7 @@
       </w:rPr>
     </w:lvl>
   </w:abstractNum>
-  <w:abstractNum w:abstractNumId="16" w15:restartNumberingAfterBreak="0">
+  <w:abstractNum w:abstractNumId="17" w15:restartNumberingAfterBreak="0">
     <w:nsid w:val="396B104B"/>
     <w:multiLevelType w:val="hybridMultilevel"/>
     <w:tmpl w:val="5E08E19E"/>
@@ -4010,7 +6139,7 @@
       </w:rPr>
     </w:lvl>
   </w:abstractNum>
-  <w:abstractNum w:abstractNumId="17" w15:restartNumberingAfterBreak="0">
+  <w:abstractNum w:abstractNumId="18" w15:restartNumberingAfterBreak="0">
     <w:nsid w:val="3BB54A60"/>
     <w:multiLevelType w:val="hybridMultilevel"/>
     <w:tmpl w:val="31C6BE76"/>
@@ -4123,7 +6252,7 @@
       </w:rPr>
     </w:lvl>
   </w:abstractNum>
-  <w:abstractNum w:abstractNumId="18" w15:restartNumberingAfterBreak="0">
+  <w:abstractNum w:abstractNumId="19" w15:restartNumberingAfterBreak="0">
     <w:nsid w:val="3D7A393B"/>
     <w:multiLevelType w:val="multilevel"/>
     <w:tmpl w:val="B10E151A"/>
@@ -4236,7 +6365,7 @@
       </w:pPr>
     </w:lvl>
   </w:abstractNum>
-  <w:abstractNum w:abstractNumId="19" w15:restartNumberingAfterBreak="0">
+  <w:abstractNum w:abstractNumId="20" w15:restartNumberingAfterBreak="0">
     <w:nsid w:val="41E77534"/>
     <w:multiLevelType w:val="hybridMultilevel"/>
     <w:tmpl w:val="49827B3C"/>
@@ -4349,7 +6478,7 @@
       </w:rPr>
     </w:lvl>
   </w:abstractNum>
-  <w:abstractNum w:abstractNumId="20" w15:restartNumberingAfterBreak="0">
+  <w:abstractNum w:abstractNumId="21" w15:restartNumberingAfterBreak="0">
     <w:nsid w:val="4368337F"/>
     <w:multiLevelType w:val="hybridMultilevel"/>
     <w:tmpl w:val="951CDE1C"/>
@@ -4462,7 +6591,7 @@
       </w:rPr>
     </w:lvl>
   </w:abstractNum>
-  <w:abstractNum w:abstractNumId="21" w15:restartNumberingAfterBreak="0">
+  <w:abstractNum w:abstractNumId="22" w15:restartNumberingAfterBreak="0">
     <w:nsid w:val="4CD25077"/>
     <w:multiLevelType w:val="multilevel"/>
     <w:tmpl w:val="53C07D14"/>
@@ -4575,7 +6704,7 @@
       </w:pPr>
     </w:lvl>
   </w:abstractNum>
-  <w:abstractNum w:abstractNumId="22" w15:restartNumberingAfterBreak="0">
+  <w:abstractNum w:abstractNumId="23" w15:restartNumberingAfterBreak="0">
     <w:nsid w:val="50772FB3"/>
     <w:multiLevelType w:val="hybridMultilevel"/>
     <w:tmpl w:val="3474C8E4"/>
@@ -4688,7 +6817,7 @@
       </w:rPr>
     </w:lvl>
   </w:abstractNum>
-  <w:abstractNum w:abstractNumId="23" w15:restartNumberingAfterBreak="0">
+  <w:abstractNum w:abstractNumId="24" w15:restartNumberingAfterBreak="0">
     <w:nsid w:val="5AF656CA"/>
     <w:multiLevelType w:val="hybridMultilevel"/>
     <w:tmpl w:val="1C067984"/>
@@ -4801,7 +6930,7 @@
       </w:rPr>
     </w:lvl>
   </w:abstractNum>
-  <w:abstractNum w:abstractNumId="24" w15:restartNumberingAfterBreak="0">
+  <w:abstractNum w:abstractNumId="25" w15:restartNumberingAfterBreak="0">
     <w:nsid w:val="6A2A268C"/>
     <w:multiLevelType w:val="multilevel"/>
     <w:tmpl w:val="EE607F24"/>
@@ -4950,7 +7079,7 @@
       </w:rPr>
     </w:lvl>
   </w:abstractNum>
-  <w:abstractNum w:abstractNumId="25" w15:restartNumberingAfterBreak="0">
+  <w:abstractNum w:abstractNumId="26" w15:restartNumberingAfterBreak="0">
     <w:nsid w:val="731243D5"/>
     <w:multiLevelType w:val="multilevel"/>
     <w:tmpl w:val="22404232"/>
@@ -5063,7 +7192,7 @@
       </w:pPr>
     </w:lvl>
   </w:abstractNum>
-  <w:abstractNum w:abstractNumId="26" w15:restartNumberingAfterBreak="0">
+  <w:abstractNum w:abstractNumId="27" w15:restartNumberingAfterBreak="0">
     <w:nsid w:val="7A4C77C6"/>
     <w:multiLevelType w:val="multilevel"/>
     <w:tmpl w:val="FA005712"/>
@@ -5181,7 +7310,7 @@
       </w:rPr>
     </w:lvl>
   </w:abstractNum>
-  <w:abstractNum w:abstractNumId="27" w15:restartNumberingAfterBreak="0">
+  <w:abstractNum w:abstractNumId="28" w15:restartNumberingAfterBreak="0">
     <w:nsid w:val="7C226EBA"/>
     <w:multiLevelType w:val="multilevel"/>
     <w:tmpl w:val="4E58EA1E"/>
@@ -5331,19 +7460,19 @@
     </w:lvl>
   </w:abstractNum>
   <w:num w:numId="1" w16cid:durableId="934941758">
-    <w:abstractNumId w:val="26"/>
+    <w:abstractNumId w:val="27"/>
   </w:num>
   <w:num w:numId="2" w16cid:durableId="577908328">
-    <w:abstractNumId w:val="26"/>
+    <w:abstractNumId w:val="27"/>
     <w:lvlOverride w:ilvl="0">
       <w:startOverride w:val="1"/>
     </w:lvlOverride>
   </w:num>
   <w:num w:numId="3" w16cid:durableId="1721857759">
-    <w:abstractNumId w:val="26"/>
+    <w:abstractNumId w:val="27"/>
   </w:num>
   <w:num w:numId="4" w16cid:durableId="1209953644">
-    <w:abstractNumId w:val="26"/>
+    <w:abstractNumId w:val="27"/>
     <w:lvlOverride w:ilvl="0">
       <w:startOverride w:val="1"/>
     </w:lvlOverride>
@@ -5352,13 +7481,13 @@
     <w:abstractNumId w:val="8"/>
   </w:num>
   <w:num w:numId="6" w16cid:durableId="454561288">
-    <w:abstractNumId w:val="26"/>
+    <w:abstractNumId w:val="27"/>
     <w:lvlOverride w:ilvl="0">
       <w:startOverride w:val="1"/>
     </w:lvlOverride>
   </w:num>
   <w:num w:numId="7" w16cid:durableId="572206340">
-    <w:abstractNumId w:val="26"/>
+    <w:abstractNumId w:val="27"/>
     <w:lvlOverride w:ilvl="0">
       <w:startOverride w:val="1"/>
     </w:lvlOverride>
@@ -5391,7 +7520,7 @@
     <w:abstractNumId w:val="10"/>
   </w:num>
   <w:num w:numId="9" w16cid:durableId="202450260">
-    <w:abstractNumId w:val="26"/>
+    <w:abstractNumId w:val="27"/>
     <w:lvlOverride w:ilvl="0">
       <w:startOverride w:val="1"/>
     </w:lvlOverride>
@@ -5421,7 +7550,7 @@
     </w:lvlOverride>
   </w:num>
   <w:num w:numId="10" w16cid:durableId="418328233">
-    <w:abstractNumId w:val="26"/>
+    <w:abstractNumId w:val="27"/>
     <w:lvlOverride w:ilvl="0">
       <w:startOverride w:val="1"/>
     </w:lvlOverride>
@@ -5475,25 +7604,25 @@
     <w:abstractNumId w:val="0"/>
   </w:num>
   <w:num w:numId="19" w16cid:durableId="392579233">
-    <w:abstractNumId w:val="27"/>
+    <w:abstractNumId w:val="28"/>
   </w:num>
   <w:num w:numId="20" w16cid:durableId="357630793">
     <w:abstractNumId w:val="9"/>
   </w:num>
   <w:num w:numId="21" w16cid:durableId="1504128551">
+    <w:abstractNumId w:val="26"/>
+  </w:num>
+  <w:num w:numId="22" w16cid:durableId="148523864">
     <w:abstractNumId w:val="25"/>
   </w:num>
-  <w:num w:numId="22" w16cid:durableId="148523864">
+  <w:num w:numId="23" w16cid:durableId="251165902">
     <w:abstractNumId w:val="24"/>
   </w:num>
-  <w:num w:numId="23" w16cid:durableId="251165902">
-    <w:abstractNumId w:val="23"/>
-  </w:num>
   <w:num w:numId="24" w16cid:durableId="1511291316">
-    <w:abstractNumId w:val="19"/>
+    <w:abstractNumId w:val="20"/>
   </w:num>
   <w:num w:numId="25" w16cid:durableId="1336037291">
-    <w:abstractNumId w:val="26"/>
+    <w:abstractNumId w:val="27"/>
     <w:lvlOverride w:ilvl="0">
       <w:startOverride w:val="1"/>
     </w:lvlOverride>
@@ -5523,7 +7652,7 @@
     </w:lvlOverride>
   </w:num>
   <w:num w:numId="26" w16cid:durableId="89593532">
-    <w:abstractNumId w:val="26"/>
+    <w:abstractNumId w:val="27"/>
     <w:lvlOverride w:ilvl="0">
       <w:startOverride w:val="1"/>
     </w:lvlOverride>
@@ -5553,7 +7682,7 @@
     </w:lvlOverride>
   </w:num>
   <w:num w:numId="27" w16cid:durableId="1669479936">
-    <w:abstractNumId w:val="26"/>
+    <w:abstractNumId w:val="27"/>
     <w:lvlOverride w:ilvl="0">
       <w:startOverride w:val="1"/>
     </w:lvlOverride>
@@ -5583,7 +7712,7 @@
     </w:lvlOverride>
   </w:num>
   <w:num w:numId="28" w16cid:durableId="1703939245">
-    <w:abstractNumId w:val="26"/>
+    <w:abstractNumId w:val="27"/>
     <w:lvlOverride w:ilvl="0">
       <w:startOverride w:val="1"/>
     </w:lvlOverride>
@@ -5613,7 +7742,7 @@
     </w:lvlOverride>
   </w:num>
   <w:num w:numId="29" w16cid:durableId="1042173435">
-    <w:abstractNumId w:val="26"/>
+    <w:abstractNumId w:val="27"/>
     <w:lvlOverride w:ilvl="0">
       <w:startOverride w:val="1"/>
     </w:lvlOverride>
@@ -5643,7 +7772,7 @@
     </w:lvlOverride>
   </w:num>
   <w:num w:numId="30" w16cid:durableId="82263385">
-    <w:abstractNumId w:val="26"/>
+    <w:abstractNumId w:val="27"/>
     <w:lvlOverride w:ilvl="0">
       <w:startOverride w:val="1"/>
     </w:lvlOverride>
@@ -5673,7 +7802,7 @@
     </w:lvlOverride>
   </w:num>
   <w:num w:numId="31" w16cid:durableId="978917909">
-    <w:abstractNumId w:val="26"/>
+    <w:abstractNumId w:val="27"/>
     <w:lvlOverride w:ilvl="0">
       <w:startOverride w:val="1"/>
     </w:lvlOverride>
@@ -5703,7 +7832,7 @@
     </w:lvlOverride>
   </w:num>
   <w:num w:numId="32" w16cid:durableId="1036005445">
-    <w:abstractNumId w:val="26"/>
+    <w:abstractNumId w:val="27"/>
     <w:lvlOverride w:ilvl="0">
       <w:startOverride w:val="1"/>
     </w:lvlOverride>
@@ -5733,7 +7862,7 @@
     </w:lvlOverride>
   </w:num>
   <w:num w:numId="33" w16cid:durableId="966933509">
-    <w:abstractNumId w:val="26"/>
+    <w:abstractNumId w:val="27"/>
     <w:lvlOverride w:ilvl="0">
       <w:startOverride w:val="1"/>
     </w:lvlOverride>
@@ -5763,28 +7892,28 @@
     </w:lvlOverride>
   </w:num>
   <w:num w:numId="34" w16cid:durableId="1613711422">
-    <w:abstractNumId w:val="16"/>
+    <w:abstractNumId w:val="17"/>
   </w:num>
   <w:num w:numId="35" w16cid:durableId="1201284236">
-    <w:abstractNumId w:val="22"/>
+    <w:abstractNumId w:val="23"/>
   </w:num>
   <w:num w:numId="36" w16cid:durableId="1144618275">
     <w:abstractNumId w:val="11"/>
   </w:num>
   <w:num w:numId="37" w16cid:durableId="2029869380">
-    <w:abstractNumId w:val="20"/>
+    <w:abstractNumId w:val="21"/>
   </w:num>
   <w:num w:numId="38" w16cid:durableId="1473789722">
-    <w:abstractNumId w:val="14"/>
+    <w:abstractNumId w:val="15"/>
   </w:num>
   <w:num w:numId="39" w16cid:durableId="1807702015">
-    <w:abstractNumId w:val="15"/>
+    <w:abstractNumId w:val="16"/>
   </w:num>
   <w:num w:numId="40" w16cid:durableId="729689662">
-    <w:abstractNumId w:val="17"/>
+    <w:abstractNumId w:val="18"/>
   </w:num>
   <w:num w:numId="41" w16cid:durableId="1675958321">
-    <w:abstractNumId w:val="18"/>
+    <w:abstractNumId w:val="19"/>
   </w:num>
   <w:num w:numId="42" w16cid:durableId="1502772947">
     <w:abstractNumId w:val="12"/>
@@ -5793,7 +7922,10 @@
     <w:abstractNumId w:val="13"/>
   </w:num>
   <w:num w:numId="44" w16cid:durableId="2091003412">
-    <w:abstractNumId w:val="21"/>
+    <w:abstractNumId w:val="22"/>
+  </w:num>
+  <w:num w:numId="45" w16cid:durableId="1478300123">
+    <w:abstractNumId w:val="14"/>
   </w:num>
 </w:numbering>
 </file>
@@ -31019,6 +33151,19 @@
 </file>
 
 <file path=customXml/item1.xml><?xml version="1.0" encoding="utf-8"?>
+<?mso-contentType ?>
+<FormTemplates xmlns="http://schemas.microsoft.com/sharepoint/v3/contenttype/forms">
+  <Display>DocumentLibraryForm</Display>
+  <Edit>DocumentLibraryForm</Edit>
+  <New>DocumentLibraryForm</New>
+</FormTemplates>
+</file>
+
+<file path=customXml/item2.xml><?xml version="1.0" encoding="utf-8"?>
+<b:Sources xmlns:b="http://schemas.openxmlformats.org/officeDocument/2006/bibliography" xmlns="http://schemas.openxmlformats.org/officeDocument/2006/bibliography" SelectedStyle="\APASixthEditionOfficeOnline.xsl" StyleName="APA" Version="6"/>
+</file>
+
+<file path=customXml/item3.xml><?xml version="1.0" encoding="utf-8"?>
 <p:properties xmlns:p="http://schemas.microsoft.com/office/2006/metadata/properties" xmlns:xsi="http://www.w3.org/2001/XMLSchema-instance" xmlns:pc="http://schemas.microsoft.com/office/infopath/2007/PartnerControls">
   <documentManagement>
     <_ip_UnifiedCompliancePolicyUIAction xmlns="http://schemas.microsoft.com/sharepoint/v3" xsi:nil="true"/>
@@ -31035,19 +33180,6 @@
     <MediaServiceKeyPoints xmlns="71af3243-3dd4-4a8d-8c0d-dd76da1f02a5" xsi:nil="true"/>
   </documentManagement>
 </p:properties>
-</file>
-
-<file path=customXml/item2.xml><?xml version="1.0" encoding="utf-8"?>
-<b:Sources xmlns:b="http://schemas.openxmlformats.org/officeDocument/2006/bibliography" xmlns="http://schemas.openxmlformats.org/officeDocument/2006/bibliography" SelectedStyle="\APASixthEditionOfficeOnline.xsl" StyleName="APA" Version="6"/>
-</file>
-
-<file path=customXml/item3.xml><?xml version="1.0" encoding="utf-8"?>
-<?mso-contentType ?>
-<FormTemplates xmlns="http://schemas.microsoft.com/sharepoint/v3/contenttype/forms">
-  <Display>DocumentLibraryForm</Display>
-  <Edit>DocumentLibraryForm</Edit>
-  <New>DocumentLibraryForm</New>
-</FormTemplates>
 </file>
 
 <file path=customXml/item4.xml><?xml version="1.0" encoding="utf-8"?>
@@ -31327,13 +33459,9 @@
 </file>
 
 <file path=customXml/itemProps1.xml><?xml version="1.0" encoding="utf-8"?>
-<ds:datastoreItem xmlns:ds="http://schemas.openxmlformats.org/officeDocument/2006/customXml" ds:itemID="{91E7373D-5DCA-4092-912F-7D030B4FE61E}">
+<ds:datastoreItem xmlns:ds="http://schemas.openxmlformats.org/officeDocument/2006/customXml" ds:itemID="{878A3276-187E-405F-966A-BDA24FF7DCFF}">
   <ds:schemaRefs>
-    <ds:schemaRef ds:uri="http://schemas.microsoft.com/office/2006/metadata/properties"/>
-    <ds:schemaRef ds:uri="http://schemas.microsoft.com/office/infopath/2007/PartnerControls"/>
-    <ds:schemaRef ds:uri="http://schemas.microsoft.com/sharepoint/v3"/>
-    <ds:schemaRef ds:uri="71af3243-3dd4-4a8d-8c0d-dd76da1f02a5"/>
-    <ds:schemaRef ds:uri="230e9df3-be65-4c73-a93b-d1236ebd677e"/>
+    <ds:schemaRef ds:uri="http://schemas.microsoft.com/sharepoint/v3/contenttype/forms"/>
   </ds:schemaRefs>
 </ds:datastoreItem>
 </file>
@@ -31347,9 +33475,13 @@
 </file>
 
 <file path=customXml/itemProps3.xml><?xml version="1.0" encoding="utf-8"?>
-<ds:datastoreItem xmlns:ds="http://schemas.openxmlformats.org/officeDocument/2006/customXml" ds:itemID="{878A3276-187E-405F-966A-BDA24FF7DCFF}">
+<ds:datastoreItem xmlns:ds="http://schemas.openxmlformats.org/officeDocument/2006/customXml" ds:itemID="{91E7373D-5DCA-4092-912F-7D030B4FE61E}">
   <ds:schemaRefs>
-    <ds:schemaRef ds:uri="http://schemas.microsoft.com/sharepoint/v3/contenttype/forms"/>
+    <ds:schemaRef ds:uri="http://schemas.microsoft.com/office/2006/metadata/properties"/>
+    <ds:schemaRef ds:uri="http://schemas.microsoft.com/office/infopath/2007/PartnerControls"/>
+    <ds:schemaRef ds:uri="http://schemas.microsoft.com/sharepoint/v3"/>
+    <ds:schemaRef ds:uri="71af3243-3dd4-4a8d-8c0d-dd76da1f02a5"/>
+    <ds:schemaRef ds:uri="230e9df3-be65-4c73-a93b-d1236ebd677e"/>
   </ds:schemaRefs>
 </ds:datastoreItem>
 </file>

</xml_diff>